<commit_message>
Tidy AI usage wording, B4 greeting and document link text
Co-Authored-By: Claude Opus 5.5 <noreply@anthropic.com>
</commit_message>
<xml_diff>
--- a/submission/Chandramouli_Kancharla_QA_Automation_Assessment.docx
+++ b/submission/Chandramouli_Kancharla_QA_Automation_Assessment.docx
@@ -445,7 +445,7 @@
     <w:sdt>
       <w:sdtPr>
         <w:alias w:val="Contents"/>
-        <w:id w:val="2042156401"/>
+        <w:id w:val="792559336"/>
         <w:docPartObj>
           <w:docPartGallery w:val="Table of Contents"/>
           <w:docPartUnique/>
@@ -477,7 +477,7 @@
           <w:r>
             <w:fldChar w:fldCharType="separate"/>
           </w:r>
-          <w:hyperlink w:anchor="_Toc244103840" w:history="1">
+          <w:hyperlink w:anchor="_Toc244104322" w:history="1">
             <w:r>
               <w:rPr>
                 <w:rStyle w:val="Hyperlink"/>
@@ -501,7 +501,7 @@
               <w:rPr>
                 <w:noProof/>
               </w:rPr>
-              <w:instrText xml:space="preserve"> PAGEREF _Toc244103840 \h </w:instrText>
+              <w:instrText xml:space="preserve"> PAGEREF _Toc244104322 \h </w:instrText>
             </w:r>
             <w:r>
               <w:rPr>
@@ -543,7 +543,7 @@
               <w14:ligatures w14:val="standardContextual"/>
             </w:rPr>
           </w:pPr>
-          <w:hyperlink w:anchor="_Toc244103841" w:history="1">
+          <w:hyperlink w:anchor="_Toc244104323" w:history="1">
             <w:r>
               <w:rPr>
                 <w:rStyle w:val="Hyperlink"/>
@@ -567,7 +567,7 @@
               <w:rPr>
                 <w:noProof/>
               </w:rPr>
-              <w:instrText xml:space="preserve"> PAGEREF _Toc244103841 \h </w:instrText>
+              <w:instrText xml:space="preserve"> PAGEREF _Toc244104323 \h </w:instrText>
             </w:r>
             <w:r>
               <w:rPr>
@@ -609,7 +609,7 @@
               <w14:ligatures w14:val="standardContextual"/>
             </w:rPr>
           </w:pPr>
-          <w:hyperlink w:anchor="_Toc244103842" w:history="1">
+          <w:hyperlink w:anchor="_Toc244104324" w:history="1">
             <w:r>
               <w:rPr>
                 <w:rStyle w:val="Hyperlink"/>
@@ -633,7 +633,7 @@
               <w:rPr>
                 <w:noProof/>
               </w:rPr>
-              <w:instrText xml:space="preserve"> PAGEREF _Toc244103842 \h </w:instrText>
+              <w:instrText xml:space="preserve"> PAGEREF _Toc244104324 \h </w:instrText>
             </w:r>
             <w:r>
               <w:rPr>
@@ -675,7 +675,7 @@
               <w14:ligatures w14:val="standardContextual"/>
             </w:rPr>
           </w:pPr>
-          <w:hyperlink w:anchor="_Toc244103843" w:history="1">
+          <w:hyperlink w:anchor="_Toc244104325" w:history="1">
             <w:r>
               <w:rPr>
                 <w:rStyle w:val="Hyperlink"/>
@@ -699,7 +699,7 @@
               <w:rPr>
                 <w:noProof/>
               </w:rPr>
-              <w:instrText xml:space="preserve"> PAGEREF _Toc244103843 \h </w:instrText>
+              <w:instrText xml:space="preserve"> PAGEREF _Toc244104325 \h </w:instrText>
             </w:r>
             <w:r>
               <w:rPr>
@@ -741,7 +741,7 @@
               <w14:ligatures w14:val="standardContextual"/>
             </w:rPr>
           </w:pPr>
-          <w:hyperlink w:anchor="_Toc244103844" w:history="1">
+          <w:hyperlink w:anchor="_Toc244104326" w:history="1">
             <w:r>
               <w:rPr>
                 <w:rStyle w:val="Hyperlink"/>
@@ -765,7 +765,7 @@
               <w:rPr>
                 <w:noProof/>
               </w:rPr>
-              <w:instrText xml:space="preserve"> PAGEREF _Toc244103844 \h </w:instrText>
+              <w:instrText xml:space="preserve"> PAGEREF _Toc244104326 \h </w:instrText>
             </w:r>
             <w:r>
               <w:rPr>
@@ -807,7 +807,7 @@
               <w14:ligatures w14:val="standardContextual"/>
             </w:rPr>
           </w:pPr>
-          <w:hyperlink w:anchor="_Toc244103845" w:history="1">
+          <w:hyperlink w:anchor="_Toc244104327" w:history="1">
             <w:r>
               <w:rPr>
                 <w:rStyle w:val="Hyperlink"/>
@@ -831,7 +831,7 @@
               <w:rPr>
                 <w:noProof/>
               </w:rPr>
-              <w:instrText xml:space="preserve"> PAGEREF _Toc244103845 \h </w:instrText>
+              <w:instrText xml:space="preserve"> PAGEREF _Toc244104327 \h </w:instrText>
             </w:r>
             <w:r>
               <w:rPr>
@@ -873,7 +873,7 @@
               <w14:ligatures w14:val="standardContextual"/>
             </w:rPr>
           </w:pPr>
-          <w:hyperlink w:anchor="_Toc244103846" w:history="1">
+          <w:hyperlink w:anchor="_Toc244104328" w:history="1">
             <w:r>
               <w:rPr>
                 <w:rStyle w:val="Hyperlink"/>
@@ -897,7 +897,7 @@
               <w:rPr>
                 <w:noProof/>
               </w:rPr>
-              <w:instrText xml:space="preserve"> PAGEREF _Toc244103846 \h </w:instrText>
+              <w:instrText xml:space="preserve"> PAGEREF _Toc244104328 \h </w:instrText>
             </w:r>
             <w:r>
               <w:rPr>
@@ -939,7 +939,7 @@
               <w14:ligatures w14:val="standardContextual"/>
             </w:rPr>
           </w:pPr>
-          <w:hyperlink w:anchor="_Toc244103847" w:history="1">
+          <w:hyperlink w:anchor="_Toc244104329" w:history="1">
             <w:r>
               <w:rPr>
                 <w:rStyle w:val="Hyperlink"/>
@@ -963,7 +963,7 @@
               <w:rPr>
                 <w:noProof/>
               </w:rPr>
-              <w:instrText xml:space="preserve"> PAGEREF _Toc244103847 \h </w:instrText>
+              <w:instrText xml:space="preserve"> PAGEREF _Toc244104329 \h </w:instrText>
             </w:r>
             <w:r>
               <w:rPr>
@@ -1005,7 +1005,7 @@
               <w14:ligatures w14:val="standardContextual"/>
             </w:rPr>
           </w:pPr>
-          <w:hyperlink w:anchor="_Toc244103848" w:history="1">
+          <w:hyperlink w:anchor="_Toc244104330" w:history="1">
             <w:r>
               <w:rPr>
                 <w:rStyle w:val="Hyperlink"/>
@@ -1029,7 +1029,7 @@
               <w:rPr>
                 <w:noProof/>
               </w:rPr>
-              <w:instrText xml:space="preserve"> PAGEREF _Toc244103848 \h </w:instrText>
+              <w:instrText xml:space="preserve"> PAGEREF _Toc244104330 \h </w:instrText>
             </w:r>
             <w:r>
               <w:rPr>
@@ -1071,7 +1071,7 @@
               <w14:ligatures w14:val="standardContextual"/>
             </w:rPr>
           </w:pPr>
-          <w:hyperlink w:anchor="_Toc244103849" w:history="1">
+          <w:hyperlink w:anchor="_Toc244104331" w:history="1">
             <w:r>
               <w:rPr>
                 <w:rStyle w:val="Hyperlink"/>
@@ -1095,7 +1095,7 @@
               <w:rPr>
                 <w:noProof/>
               </w:rPr>
-              <w:instrText xml:space="preserve"> PAGEREF _Toc244103849 \h </w:instrText>
+              <w:instrText xml:space="preserve"> PAGEREF _Toc244104331 \h </w:instrText>
             </w:r>
             <w:r>
               <w:rPr>
@@ -1137,7 +1137,7 @@
               <w14:ligatures w14:val="standardContextual"/>
             </w:rPr>
           </w:pPr>
-          <w:hyperlink w:anchor="_Toc244103850" w:history="1">
+          <w:hyperlink w:anchor="_Toc244104332" w:history="1">
             <w:r>
               <w:rPr>
                 <w:rStyle w:val="Hyperlink"/>
@@ -1161,7 +1161,7 @@
               <w:rPr>
                 <w:noProof/>
               </w:rPr>
-              <w:instrText xml:space="preserve"> PAGEREF _Toc244103850 \h </w:instrText>
+              <w:instrText xml:space="preserve"> PAGEREF _Toc244104332 \h </w:instrText>
             </w:r>
             <w:r>
               <w:rPr>
@@ -1203,7 +1203,7 @@
               <w14:ligatures w14:val="standardContextual"/>
             </w:rPr>
           </w:pPr>
-          <w:hyperlink w:anchor="_Toc244103851" w:history="1">
+          <w:hyperlink w:anchor="_Toc244104333" w:history="1">
             <w:r>
               <w:rPr>
                 <w:rStyle w:val="Hyperlink"/>
@@ -1227,7 +1227,7 @@
               <w:rPr>
                 <w:noProof/>
               </w:rPr>
-              <w:instrText xml:space="preserve"> PAGEREF _Toc244103851 \h </w:instrText>
+              <w:instrText xml:space="preserve"> PAGEREF _Toc244104333 \h </w:instrText>
             </w:r>
             <w:r>
               <w:rPr>
@@ -1269,7 +1269,7 @@
               <w14:ligatures w14:val="standardContextual"/>
             </w:rPr>
           </w:pPr>
-          <w:hyperlink w:anchor="_Toc244103852" w:history="1">
+          <w:hyperlink w:anchor="_Toc244104334" w:history="1">
             <w:r>
               <w:rPr>
                 <w:rStyle w:val="Hyperlink"/>
@@ -1293,7 +1293,7 @@
               <w:rPr>
                 <w:noProof/>
               </w:rPr>
-              <w:instrText xml:space="preserve"> PAGEREF _Toc244103852 \h </w:instrText>
+              <w:instrText xml:space="preserve"> PAGEREF _Toc244104334 \h </w:instrText>
             </w:r>
             <w:r>
               <w:rPr>
@@ -1335,7 +1335,7 @@
               <w14:ligatures w14:val="standardContextual"/>
             </w:rPr>
           </w:pPr>
-          <w:hyperlink w:anchor="_Toc244103853" w:history="1">
+          <w:hyperlink w:anchor="_Toc244104335" w:history="1">
             <w:r>
               <w:rPr>
                 <w:rStyle w:val="Hyperlink"/>
@@ -1359,7 +1359,7 @@
               <w:rPr>
                 <w:noProof/>
               </w:rPr>
-              <w:instrText xml:space="preserve"> PAGEREF _Toc244103853 \h </w:instrText>
+              <w:instrText xml:space="preserve"> PAGEREF _Toc244104335 \h </w:instrText>
             </w:r>
             <w:r>
               <w:rPr>
@@ -1401,7 +1401,7 @@
               <w14:ligatures w14:val="standardContextual"/>
             </w:rPr>
           </w:pPr>
-          <w:hyperlink w:anchor="_Toc244103854" w:history="1">
+          <w:hyperlink w:anchor="_Toc244104336" w:history="1">
             <w:r>
               <w:rPr>
                 <w:rStyle w:val="Hyperlink"/>
@@ -1425,7 +1425,7 @@
               <w:rPr>
                 <w:noProof/>
               </w:rPr>
-              <w:instrText xml:space="preserve"> PAGEREF _Toc244103854 \h </w:instrText>
+              <w:instrText xml:space="preserve"> PAGEREF _Toc244104336 \h </w:instrText>
             </w:r>
             <w:r>
               <w:rPr>
@@ -1467,7 +1467,7 @@
               <w14:ligatures w14:val="standardContextual"/>
             </w:rPr>
           </w:pPr>
-          <w:hyperlink w:anchor="_Toc244103855" w:history="1">
+          <w:hyperlink w:anchor="_Toc244104337" w:history="1">
             <w:r>
               <w:rPr>
                 <w:rStyle w:val="Hyperlink"/>
@@ -1491,7 +1491,7 @@
               <w:rPr>
                 <w:noProof/>
               </w:rPr>
-              <w:instrText xml:space="preserve"> PAGEREF _Toc244103855 \h </w:instrText>
+              <w:instrText xml:space="preserve"> PAGEREF _Toc244104337 \h </w:instrText>
             </w:r>
             <w:r>
               <w:rPr>
@@ -1533,7 +1533,7 @@
               <w14:ligatures w14:val="standardContextual"/>
             </w:rPr>
           </w:pPr>
-          <w:hyperlink w:anchor="_Toc244103856" w:history="1">
+          <w:hyperlink w:anchor="_Toc244104338" w:history="1">
             <w:r>
               <w:rPr>
                 <w:rStyle w:val="Hyperlink"/>
@@ -1557,7 +1557,7 @@
               <w:rPr>
                 <w:noProof/>
               </w:rPr>
-              <w:instrText xml:space="preserve"> PAGEREF _Toc244103856 \h </w:instrText>
+              <w:instrText xml:space="preserve"> PAGEREF _Toc244104338 \h </w:instrText>
             </w:r>
             <w:r>
               <w:rPr>
@@ -1599,7 +1599,7 @@
               <w14:ligatures w14:val="standardContextual"/>
             </w:rPr>
           </w:pPr>
-          <w:hyperlink w:anchor="_Toc244103857" w:history="1">
+          <w:hyperlink w:anchor="_Toc244104339" w:history="1">
             <w:r>
               <w:rPr>
                 <w:rStyle w:val="Hyperlink"/>
@@ -1623,7 +1623,7 @@
               <w:rPr>
                 <w:noProof/>
               </w:rPr>
-              <w:instrText xml:space="preserve"> PAGEREF _Toc244103857 \h </w:instrText>
+              <w:instrText xml:space="preserve"> PAGEREF _Toc244104339 \h </w:instrText>
             </w:r>
             <w:r>
               <w:rPr>
@@ -1665,7 +1665,7 @@
               <w14:ligatures w14:val="standardContextual"/>
             </w:rPr>
           </w:pPr>
-          <w:hyperlink w:anchor="_Toc244103858" w:history="1">
+          <w:hyperlink w:anchor="_Toc244104340" w:history="1">
             <w:r>
               <w:rPr>
                 <w:rStyle w:val="Hyperlink"/>
@@ -1689,7 +1689,7 @@
               <w:rPr>
                 <w:noProof/>
               </w:rPr>
-              <w:instrText xml:space="preserve"> PAGEREF _Toc244103858 \h </w:instrText>
+              <w:instrText xml:space="preserve"> PAGEREF _Toc244104340 \h </w:instrText>
             </w:r>
             <w:r>
               <w:rPr>
@@ -1731,7 +1731,7 @@
               <w14:ligatures w14:val="standardContextual"/>
             </w:rPr>
           </w:pPr>
-          <w:hyperlink w:anchor="_Toc244103859" w:history="1">
+          <w:hyperlink w:anchor="_Toc244104341" w:history="1">
             <w:r>
               <w:rPr>
                 <w:rStyle w:val="Hyperlink"/>
@@ -1755,7 +1755,7 @@
               <w:rPr>
                 <w:noProof/>
               </w:rPr>
-              <w:instrText xml:space="preserve"> PAGEREF _Toc244103859 \h </w:instrText>
+              <w:instrText xml:space="preserve"> PAGEREF _Toc244104341 \h </w:instrText>
             </w:r>
             <w:r>
               <w:rPr>
@@ -1797,7 +1797,7 @@
               <w14:ligatures w14:val="standardContextual"/>
             </w:rPr>
           </w:pPr>
-          <w:hyperlink w:anchor="_Toc244103860" w:history="1">
+          <w:hyperlink w:anchor="_Toc244104342" w:history="1">
             <w:r>
               <w:rPr>
                 <w:rStyle w:val="Hyperlink"/>
@@ -1821,7 +1821,7 @@
               <w:rPr>
                 <w:noProof/>
               </w:rPr>
-              <w:instrText xml:space="preserve"> PAGEREF _Toc244103860 \h </w:instrText>
+              <w:instrText xml:space="preserve"> PAGEREF _Toc244104342 \h </w:instrText>
             </w:r>
             <w:r>
               <w:rPr>
@@ -1863,7 +1863,7 @@
               <w14:ligatures w14:val="standardContextual"/>
             </w:rPr>
           </w:pPr>
-          <w:hyperlink w:anchor="_Toc244103861" w:history="1">
+          <w:hyperlink w:anchor="_Toc244104343" w:history="1">
             <w:r>
               <w:rPr>
                 <w:rStyle w:val="Hyperlink"/>
@@ -1887,7 +1887,7 @@
               <w:rPr>
                 <w:noProof/>
               </w:rPr>
-              <w:instrText xml:space="preserve"> PAGEREF _Toc244103861 \h </w:instrText>
+              <w:instrText xml:space="preserve"> PAGEREF _Toc244104343 \h </w:instrText>
             </w:r>
             <w:r>
               <w:rPr>
@@ -1929,7 +1929,7 @@
               <w14:ligatures w14:val="standardContextual"/>
             </w:rPr>
           </w:pPr>
-          <w:hyperlink w:anchor="_Toc244103862" w:history="1">
+          <w:hyperlink w:anchor="_Toc244104344" w:history="1">
             <w:r>
               <w:rPr>
                 <w:rStyle w:val="Hyperlink"/>
@@ -1953,7 +1953,7 @@
               <w:rPr>
                 <w:noProof/>
               </w:rPr>
-              <w:instrText xml:space="preserve"> PAGEREF _Toc244103862 \h </w:instrText>
+              <w:instrText xml:space="preserve"> PAGEREF _Toc244104344 \h </w:instrText>
             </w:r>
             <w:r>
               <w:rPr>
@@ -1995,7 +1995,7 @@
               <w14:ligatures w14:val="standardContextual"/>
             </w:rPr>
           </w:pPr>
-          <w:hyperlink w:anchor="_Toc244103863" w:history="1">
+          <w:hyperlink w:anchor="_Toc244104345" w:history="1">
             <w:r>
               <w:rPr>
                 <w:rStyle w:val="Hyperlink"/>
@@ -2019,7 +2019,7 @@
               <w:rPr>
                 <w:noProof/>
               </w:rPr>
-              <w:instrText xml:space="preserve"> PAGEREF _Toc244103863 \h </w:instrText>
+              <w:instrText xml:space="preserve"> PAGEREF _Toc244104345 \h </w:instrText>
             </w:r>
             <w:r>
               <w:rPr>
@@ -2061,7 +2061,7 @@
               <w14:ligatures w14:val="standardContextual"/>
             </w:rPr>
           </w:pPr>
-          <w:hyperlink w:anchor="_Toc244103864" w:history="1">
+          <w:hyperlink w:anchor="_Toc244104346" w:history="1">
             <w:r>
               <w:rPr>
                 <w:rStyle w:val="Hyperlink"/>
@@ -2085,7 +2085,7 @@
               <w:rPr>
                 <w:noProof/>
               </w:rPr>
-              <w:instrText xml:space="preserve"> PAGEREF _Toc244103864 \h </w:instrText>
+              <w:instrText xml:space="preserve"> PAGEREF _Toc244104346 \h </w:instrText>
             </w:r>
             <w:r>
               <w:rPr>
@@ -2127,7 +2127,7 @@
               <w14:ligatures w14:val="standardContextual"/>
             </w:rPr>
           </w:pPr>
-          <w:hyperlink w:anchor="_Toc244103865" w:history="1">
+          <w:hyperlink w:anchor="_Toc244104347" w:history="1">
             <w:r>
               <w:rPr>
                 <w:rStyle w:val="Hyperlink"/>
@@ -2151,7 +2151,7 @@
               <w:rPr>
                 <w:noProof/>
               </w:rPr>
-              <w:instrText xml:space="preserve"> PAGEREF _Toc244103865 \h </w:instrText>
+              <w:instrText xml:space="preserve"> PAGEREF _Toc244104347 \h </w:instrText>
             </w:r>
             <w:r>
               <w:rPr>
@@ -2193,13 +2193,13 @@
               <w14:ligatures w14:val="standardContextual"/>
             </w:rPr>
           </w:pPr>
-          <w:hyperlink w:anchor="_Toc244103866" w:history="1">
+          <w:hyperlink w:anchor="_Toc244104348" w:history="1">
             <w:r>
               <w:rPr>
                 <w:rStyle w:val="Hyperlink"/>
                 <w:noProof/>
               </w:rPr>
-              <w:t>What is mine</w:t>
+              <w:t>My role</w:t>
             </w:r>
             <w:r>
               <w:rPr>
@@ -2217,7 +2217,7 @@
               <w:rPr>
                 <w:noProof/>
               </w:rPr>
-              <w:instrText xml:space="preserve"> PAGEREF _Toc244103866 \h </w:instrText>
+              <w:instrText xml:space="preserve"> PAGEREF _Toc244104348 \h </w:instrText>
             </w:r>
             <w:r>
               <w:rPr>
@@ -2259,7 +2259,7 @@
               <w14:ligatures w14:val="standardContextual"/>
             </w:rPr>
           </w:pPr>
-          <w:hyperlink w:anchor="_Toc244103867" w:history="1">
+          <w:hyperlink w:anchor="_Toc244104349" w:history="1">
             <w:r>
               <w:rPr>
                 <w:rStyle w:val="Hyperlink"/>
@@ -2283,7 +2283,7 @@
               <w:rPr>
                 <w:noProof/>
               </w:rPr>
-              <w:instrText xml:space="preserve"> PAGEREF _Toc244103867 \h </w:instrText>
+              <w:instrText xml:space="preserve"> PAGEREF _Toc244104349 \h </w:instrText>
             </w:r>
             <w:r>
               <w:rPr>
@@ -2325,7 +2325,7 @@
               <w14:ligatures w14:val="standardContextual"/>
             </w:rPr>
           </w:pPr>
-          <w:hyperlink w:anchor="_Toc244103868" w:history="1">
+          <w:hyperlink w:anchor="_Toc244104350" w:history="1">
             <w:r>
               <w:rPr>
                 <w:rStyle w:val="Hyperlink"/>
@@ -2349,7 +2349,7 @@
               <w:rPr>
                 <w:noProof/>
               </w:rPr>
-              <w:instrText xml:space="preserve"> PAGEREF _Toc244103868 \h </w:instrText>
+              <w:instrText xml:space="preserve"> PAGEREF _Toc244104350 \h </w:instrText>
             </w:r>
             <w:r>
               <w:rPr>
@@ -2391,7 +2391,7 @@
               <w14:ligatures w14:val="standardContextual"/>
             </w:rPr>
           </w:pPr>
-          <w:hyperlink w:anchor="_Toc244103869" w:history="1">
+          <w:hyperlink w:anchor="_Toc244104351" w:history="1">
             <w:r>
               <w:rPr>
                 <w:rStyle w:val="Hyperlink"/>
@@ -2415,7 +2415,7 @@
               <w:rPr>
                 <w:noProof/>
               </w:rPr>
-              <w:instrText xml:space="preserve"> PAGEREF _Toc244103869 \h </w:instrText>
+              <w:instrText xml:space="preserve"> PAGEREF _Toc244104351 \h </w:instrText>
             </w:r>
             <w:r>
               <w:rPr>
@@ -2457,7 +2457,7 @@
               <w14:ligatures w14:val="standardContextual"/>
             </w:rPr>
           </w:pPr>
-          <w:hyperlink w:anchor="_Toc244103870" w:history="1">
+          <w:hyperlink w:anchor="_Toc244104352" w:history="1">
             <w:r>
               <w:rPr>
                 <w:rStyle w:val="Hyperlink"/>
@@ -2481,7 +2481,7 @@
               <w:rPr>
                 <w:noProof/>
               </w:rPr>
-              <w:instrText xml:space="preserve"> PAGEREF _Toc244103870 \h </w:instrText>
+              <w:instrText xml:space="preserve"> PAGEREF _Toc244104352 \h </w:instrText>
             </w:r>
             <w:r>
               <w:rPr>
@@ -2523,7 +2523,7 @@
               <w14:ligatures w14:val="standardContextual"/>
             </w:rPr>
           </w:pPr>
-          <w:hyperlink w:anchor="_Toc244103871" w:history="1">
+          <w:hyperlink w:anchor="_Toc244104353" w:history="1">
             <w:r>
               <w:rPr>
                 <w:rStyle w:val="Hyperlink"/>
@@ -2547,7 +2547,7 @@
               <w:rPr>
                 <w:noProof/>
               </w:rPr>
-              <w:instrText xml:space="preserve"> PAGEREF _Toc244103871 \h </w:instrText>
+              <w:instrText xml:space="preserve"> PAGEREF _Toc244104353 \h </w:instrText>
             </w:r>
             <w:r>
               <w:rPr>
@@ -2590,7 +2590,7 @@
       <w:pPr>
         <w:pStyle w:val="Heading1"/>
       </w:pPr>
-      <w:bookmarkStart w:id="0" w:name="_Toc244103840"/>
+      <w:bookmarkStart w:id="0" w:name="_Toc244104322"/>
       <w:r>
         <w:lastRenderedPageBreak/>
         <w:t>Summary</w:t>
@@ -3568,7 +3568,7 @@
                 <w:sz w:val="18"/>
                 <w:szCs w:val="18"/>
               </w:rPr>
-              <w:t>126 words, recommendation and alternative</w:t>
+              <w:t>125 words, recommendation and alternative</w:t>
             </w:r>
           </w:p>
         </w:tc>
@@ -3709,7 +3709,7 @@
       <w:pPr>
         <w:pStyle w:val="Heading1"/>
       </w:pPr>
-      <w:bookmarkStart w:id="1" w:name="_Toc244103841"/>
+      <w:bookmarkStart w:id="1" w:name="_Toc244104323"/>
       <w:r>
         <w:lastRenderedPageBreak/>
         <w:t>Section A1 — Manual test suite</w:t>
@@ -3720,7 +3720,7 @@
       <w:pPr>
         <w:pStyle w:val="Heading2"/>
       </w:pPr>
-      <w:bookmarkStart w:id="2" w:name="_Toc244103842"/>
+      <w:bookmarkStart w:id="2" w:name="_Toc244104324"/>
       <w:r>
         <w:t>A1.1 Questions for the product owner, and the assumption tested</w:t>
       </w:r>
@@ -4493,7 +4493,7 @@
       <w:pPr>
         <w:pStyle w:val="Heading2"/>
       </w:pPr>
-      <w:bookmarkStart w:id="3" w:name="_Toc244103843"/>
+      <w:bookmarkStart w:id="3" w:name="_Toc244104325"/>
       <w:r>
         <w:lastRenderedPageBreak/>
         <w:t>A1.2 Test cases (25 core cases)</w:t>
@@ -11590,7 +11590,7 @@
       <w:pPr>
         <w:pStyle w:val="Heading2"/>
       </w:pPr>
-      <w:bookmarkStart w:id="4" w:name="_Toc244103844"/>
+      <w:bookmarkStart w:id="4" w:name="_Toc244104326"/>
       <w:r>
         <w:lastRenderedPageBreak/>
         <w:t>A1.3 Exploratory charter — EX-01 (15 minutes, problem_user)</w:t>
@@ -12139,7 +12139,7 @@
       <w:pPr>
         <w:pStyle w:val="Heading2"/>
       </w:pPr>
-      <w:bookmarkStart w:id="5" w:name="_Toc244103845"/>
+      <w:bookmarkStart w:id="5" w:name="_Toc244104327"/>
       <w:r>
         <w:t>A1.4 Strategy (under 150 words)</w:t>
       </w:r>
@@ -12238,7 +12238,7 @@
       <w:pPr>
         <w:pStyle w:val="Heading1"/>
       </w:pPr>
-      <w:bookmarkStart w:id="6" w:name="_Toc244103846"/>
+      <w:bookmarkStart w:id="6" w:name="_Toc244104328"/>
       <w:r>
         <w:lastRenderedPageBreak/>
         <w:t>Section A2 — Automation suite</w:t>
@@ -12257,7 +12257,7 @@
       <w:pPr>
         <w:pStyle w:val="Heading2"/>
       </w:pPr>
-      <w:bookmarkStart w:id="7" w:name="_Toc244103847"/>
+      <w:bookmarkStart w:id="7" w:name="_Toc244104329"/>
       <w:r>
         <w:t>Setup</w:t>
       </w:r>
@@ -12339,7 +12339,7 @@
       <w:pPr>
         <w:pStyle w:val="Heading2"/>
       </w:pPr>
-      <w:bookmarkStart w:id="8" w:name="_Toc244103848"/>
+      <w:bookmarkStart w:id="8" w:name="_Toc244104330"/>
       <w:r>
         <w:t>Running the tests</w:t>
       </w:r>
@@ -13004,7 +13004,7 @@
       <w:pPr>
         <w:pStyle w:val="Heading2"/>
       </w:pPr>
-      <w:bookmarkStart w:id="9" w:name="_Toc244103849"/>
+      <w:bookmarkStart w:id="9" w:name="_Toc244104331"/>
       <w:r>
         <w:t>Reports and failure evidence</w:t>
       </w:r>
@@ -13410,7 +13410,7 @@
       <w:pPr>
         <w:pStyle w:val="Heading2"/>
       </w:pPr>
-      <w:bookmarkStart w:id="10" w:name="_Toc244103850"/>
+      <w:bookmarkStart w:id="10" w:name="_Toc244104332"/>
       <w:r>
         <w:t>How the brief's rules are met</w:t>
       </w:r>
@@ -14133,7 +14133,7 @@
       <w:pPr>
         <w:pStyle w:val="Heading2"/>
       </w:pPr>
-      <w:bookmarkStart w:id="11" w:name="_Toc244103851"/>
+      <w:bookmarkStart w:id="11" w:name="_Toc244104333"/>
       <w:r>
         <w:lastRenderedPageBreak/>
         <w:t>Manual case → automated test mapping</w:t>
@@ -14145,7 +14145,7 @@
         <w:spacing w:after="100"/>
       </w:pPr>
       <w:r>
-        <w:t>Every automated scenario starts with its manual case ID and carries it as a tag. Results are from the final run, retries 0 (see [Results]()).</w:t>
+        <w:t>Every automated scenario starts with its manual case ID and carries it as a tag. Results are from the final run, retries 0 (see Results).</w:t>
       </w:r>
     </w:p>
     <w:tbl>
@@ -17314,7 +17314,7 @@
       <w:pPr>
         <w:pStyle w:val="Heading2"/>
       </w:pPr>
-      <w:bookmarkStart w:id="12" w:name="_Toc244103852"/>
+      <w:bookmarkStart w:id="12" w:name="_Toc244104334"/>
       <w:r>
         <w:lastRenderedPageBreak/>
         <w:t>Results</w:t>
@@ -17859,7 +17859,7 @@
       <w:pPr>
         <w:pStyle w:val="Heading2"/>
       </w:pPr>
-      <w:bookmarkStart w:id="13" w:name="_Toc244103853"/>
+      <w:bookmarkStart w:id="13" w:name="_Toc244104335"/>
       <w:r>
         <w:lastRenderedPageBreak/>
         <w:t>Growing the suite to 200 tests</w:t>
@@ -17967,7 +17967,7 @@
       <w:pPr>
         <w:pStyle w:val="Heading1"/>
       </w:pPr>
-      <w:bookmarkStart w:id="14" w:name="_Toc244103854"/>
+      <w:bookmarkStart w:id="14" w:name="_Toc244104336"/>
       <w:r>
         <w:lastRenderedPageBreak/>
         <w:t>Section B1 — Review of the AI-generated cart-total test</w:t>
@@ -20415,7 +20415,7 @@
       <w:pPr>
         <w:pStyle w:val="Heading1"/>
       </w:pPr>
-      <w:bookmarkStart w:id="15" w:name="_Toc244103855"/>
+      <w:bookmarkStart w:id="15" w:name="_Toc244104337"/>
       <w:r>
         <w:t>Section B2 — AI evaluation plan: test case generator</w:t>
       </w:r>
@@ -21384,7 +21384,7 @@
       <w:pPr>
         <w:pStyle w:val="Heading1"/>
       </w:pPr>
-      <w:bookmarkStart w:id="16" w:name="_Toc244103856"/>
+      <w:bookmarkStart w:id="16" w:name="_Toc244104338"/>
       <w:r>
         <w:lastRenderedPageBreak/>
         <w:t>Section B3 — Jira defect report</w:t>
@@ -22027,7 +22027,7 @@
       <w:pPr>
         <w:pStyle w:val="Heading1"/>
       </w:pPr>
-      <w:bookmarkStart w:id="17" w:name="_Toc244103857"/>
+      <w:bookmarkStart w:id="17" w:name="_Toc244104339"/>
       <w:r>
         <w:t>Section B4 — Message to the client</w:t>
       </w:r>
@@ -22042,7 +22042,7 @@
         <w:ind w:left="400"/>
       </w:pPr>
       <w:r>
-        <w:t>Hi [name], here's where Friday's release stands.</w:t>
+        <w:t>Hi, here's where Friday's release stands.</w:t>
       </w:r>
     </w:p>
     <w:p>
@@ -22154,7 +22154,7 @@
           <w:i/>
           <w:iCs/>
         </w:rPr>
-        <w:t>(126 words.)</w:t>
+        <w:t>(125 words.)</w:t>
       </w:r>
     </w:p>
     <w:p>
@@ -22166,7 +22166,7 @@
       <w:pPr>
         <w:pStyle w:val="Heading1"/>
       </w:pPr>
-      <w:bookmarkStart w:id="18" w:name="_Toc244103858"/>
+      <w:bookmarkStart w:id="18" w:name="_Toc244104340"/>
       <w:r>
         <w:lastRenderedPageBreak/>
         <w:t>Section C — Notes for the live discussion</w:t>
@@ -22185,7 +22185,7 @@
       <w:pPr>
         <w:pStyle w:val="Heading2"/>
       </w:pPr>
-      <w:bookmarkStart w:id="19" w:name="_Toc244103859"/>
+      <w:bookmarkStart w:id="19" w:name="_Toc244104341"/>
       <w:r>
         <w:t>C1 — "Checkout has been failing for some users since this morning"</w:t>
       </w:r>
@@ -22395,7 +22395,7 @@
       <w:pPr>
         <w:pStyle w:val="Heading2"/>
       </w:pPr>
-      <w:bookmarkStart w:id="20" w:name="_Toc244103860"/>
+      <w:bookmarkStart w:id="20" w:name="_Toc244104342"/>
       <w:r>
         <w:t>C2 — A recent production issue</w:t>
       </w:r>
@@ -22876,7 +22876,7 @@
       <w:pPr>
         <w:pStyle w:val="Heading1"/>
       </w:pPr>
-      <w:bookmarkStart w:id="21" w:name="_Toc244103861"/>
+      <w:bookmarkStart w:id="21" w:name="_Toc244104343"/>
       <w:r>
         <w:lastRenderedPageBreak/>
         <w:t>AI usage</w:t>
@@ -22895,7 +22895,7 @@
       <w:pPr>
         <w:pStyle w:val="Heading2"/>
       </w:pPr>
-      <w:bookmarkStart w:id="22" w:name="_Toc244103862"/>
+      <w:bookmarkStart w:id="22" w:name="_Toc244104344"/>
       <w:r>
         <w:t>Tool</w:t>
       </w:r>
@@ -22913,14 +22913,14 @@
         <w:t>Claude Code</w:t>
       </w:r>
       <w:r>
-        <w:t xml:space="preserve"> (Anthropic, model Claude Opus 5.5), used as a coding agent in VS Code on my machine on 27–28 October 2026. Two sessions worked on the same repository: one for the functional suite, the documents and the Excel, and one for the accessibility and security suites. They agreed which files each one owned, so neither overwrote the other.</w:t>
+        <w:t xml:space="preserve"> (Anthropic), used as a coding assistant in VS Code on 27–28 October 2026. I gave it the tasks below, reviewed what it produced, and checked the result of every test run.</w:t>
       </w:r>
     </w:p>
     <w:p>
       <w:pPr>
         <w:pStyle w:val="Heading2"/>
       </w:pPr>
-      <w:bookmarkStart w:id="23" w:name="_Toc244103863"/>
+      <w:bookmarkStart w:id="23" w:name="_Toc244104345"/>
       <w:r>
         <w:t>Where AI was used and what I asked for</w:t>
       </w:r>
@@ -23442,7 +23442,7 @@
       <w:pPr>
         <w:pStyle w:val="Heading2"/>
       </w:pPr>
-      <w:bookmarkStart w:id="24" w:name="_Toc244103864"/>
+      <w:bookmarkStart w:id="24" w:name="_Toc244104346"/>
       <w:r>
         <w:t>AI output I checked and corrected</w:t>
       </w:r>
@@ -24674,7 +24674,7 @@
       <w:pPr>
         <w:pStyle w:val="Heading2"/>
       </w:pPr>
-      <w:bookmarkStart w:id="25" w:name="_Toc244103865"/>
+      <w:bookmarkStart w:id="25" w:name="_Toc244104347"/>
       <w:r>
         <w:t>How the results were verified</w:t>
       </w:r>
@@ -24760,9 +24760,9 @@
       <w:pPr>
         <w:pStyle w:val="Heading2"/>
       </w:pPr>
-      <w:bookmarkStart w:id="26" w:name="_Toc244103866"/>
+      <w:bookmarkStart w:id="26" w:name="_Toc244104348"/>
       <w:r>
-        <w:t>What is mine</w:t>
+        <w:t>My role</w:t>
       </w:r>
       <w:bookmarkEnd w:id="26"/>
     </w:p>
@@ -24778,14 +24778,14 @@
         </w:sectPr>
       </w:pPr>
       <w:r>
-        <w:t>I chose the scope, the 25 core cases, the bug classifications and the assumptions, reviewed the generated code and documents, and rejected changes I did not ask for. The code and documents were produced with AI assistance; I am not claiming I wrote them unaided.</w:t>
+        <w:t>I set the scope and chose the 25 core cases, the framework and the project structure. I decided how each failure was classified and which unclear rules became product-owner questions. I reviewed every change Claude Code generated, caught and corrected the mistakes listed above, and rejected changes I had not asked for. The code and documents were written with Claude Code's help, under my direction and review.</w:t>
       </w:r>
     </w:p>
     <w:p>
       <w:pPr>
         <w:pStyle w:val="Heading1"/>
       </w:pPr>
-      <w:bookmarkStart w:id="27" w:name="_Toc244103867"/>
+      <w:bookmarkStart w:id="27" w:name="_Toc244104349"/>
       <w:r>
         <w:lastRenderedPageBreak/>
         <w:t>Appendix A — Work beyond the brief</w:t>
@@ -24804,7 +24804,7 @@
       <w:pPr>
         <w:pStyle w:val="Heading2"/>
       </w:pPr>
-      <w:bookmarkStart w:id="28" w:name="_Toc244103868"/>
+      <w:bookmarkStart w:id="28" w:name="_Toc244104350"/>
       <w:r>
         <w:t>Extra suites</w:t>
       </w:r>
@@ -25344,7 +25344,7 @@
       <w:pPr>
         <w:pStyle w:val="Heading2"/>
       </w:pPr>
-      <w:bookmarkStart w:id="29" w:name="_Toc244103869"/>
+      <w:bookmarkStart w:id="29" w:name="_Toc244104351"/>
       <w:r>
         <w:t>Whole-suite results (final run, retries 0)</w:t>
       </w:r>
@@ -26212,7 +26212,7 @@
       <w:pPr>
         <w:pStyle w:val="Heading2"/>
       </w:pPr>
-      <w:bookmarkStart w:id="30" w:name="_Toc244103870"/>
+      <w:bookmarkStart w:id="30" w:name="_Toc244104352"/>
       <w:r>
         <w:t>Findings from the automated accessibility and security checks</w:t>
       </w:r>
@@ -26235,7 +26235,7 @@
       <w:pPr>
         <w:pStyle w:val="Heading1"/>
       </w:pPr>
-      <w:bookmarkStart w:id="31" w:name="_Toc244103871"/>
+      <w:bookmarkStart w:id="31" w:name="_Toc244104353"/>
       <w:r>
         <w:lastRenderedPageBreak/>
         <w:t>Appendix B — Extended test cases (TC26–TC98)</w:t>
@@ -38394,10 +38394,72 @@
 <file path=word/numbering.xml><?xml version="1.0" encoding="utf-8"?>
 <w:numbering xmlns:wpc="http://schemas.microsoft.com/office/word/2010/wordprocessingCanvas" xmlns:cx="http://schemas.microsoft.com/office/drawing/2014/chartex" xmlns:cx1="http://schemas.microsoft.com/office/drawing/2015/9/8/chartex" xmlns:cx2="http://schemas.microsoft.com/office/drawing/2015/10/21/chartex" xmlns:cx3="http://schemas.microsoft.com/office/drawing/2016/5/9/chartex" xmlns:cx4="http://schemas.microsoft.com/office/drawing/2016/5/10/chartex" xmlns:cx5="http://schemas.microsoft.com/office/drawing/2016/5/11/chartex" xmlns:cx6="http://schemas.microsoft.com/office/drawing/2016/5/12/chartex" xmlns:cx7="http://schemas.microsoft.com/office/drawing/2016/5/13/chartex" xmlns:cx8="http://schemas.microsoft.com/office/drawing/2016/5/14/chartex" xmlns:mc="http://schemas.openxmlformats.org/markup-compatibility/2006" xmlns:aink="http://schemas.microsoft.com/office/drawing/2016/ink" xmlns:am3d="http://schemas.microsoft.com/office/drawing/2017/model3d" xmlns:o="urn:schemas-microsoft-com:office:office" xmlns:oel="http://schemas.microsoft.com/office/2019/extlst" xmlns:r="http://schemas.openxmlformats.org/officeDocument/2006/relationships" xmlns:m="http://schemas.openxmlformats.org/officeDocument/2006/math" xmlns:v="urn:schemas-microsoft-com:vml" xmlns:wp14="http://schemas.microsoft.com/office/word/2010/wordprocessingDrawing" xmlns:wp="http://schemas.openxmlformats.org/drawingml/2006/wordprocessingDrawing" xmlns:w10="urn:schemas-microsoft-com:office:word" xmlns:w="http://schemas.openxmlformats.org/wordprocessingml/2006/main" xmlns:w14="http://schemas.microsoft.com/office/word/2010/wordml" xmlns:w15="http://schemas.microsoft.com/office/word/2012/wordml" xmlns:w16cex="http://schemas.microsoft.com/office/word/2018/wordml/cex" xmlns:w16cid="http://schemas.microsoft.com/office/word/2016/wordml/cid" xmlns:w16="http://schemas.microsoft.com/office/word/2018/wordml" xmlns:w16du="http://schemas.microsoft.com/office/word/2023/wordml/word16du" xmlns:w16sdtdh="http://schemas.microsoft.com/office/word/2020/wordml/sdtdatahash" xmlns:w16sdtfl="http://schemas.microsoft.com/office/word/2024/wordml/sdtformatlock" xmlns:w16se="http://schemas.microsoft.com/office/word/2015/wordml/symex" xmlns:wpg="http://schemas.microsoft.com/office/word/2010/wordprocessingGroup" xmlns:wpi="http://schemas.microsoft.com/office/word/2010/wordprocessingInk" xmlns:wne="http://schemas.microsoft.com/office/word/2006/wordml" xmlns:wps="http://schemas.microsoft.com/office/word/2010/wordprocessingShape" mc:Ignorable="w14 w15 w16se w16cid w16 w16cex w16sdtdh w16sdtfl w16du wp14">
   <w:abstractNum w:abstractNumId="0" w15:restartNumberingAfterBreak="0">
-    <w:nsid w:val="133765EF"/>
+    <w:nsid w:val="08AE19B0"/>
     <w:multiLevelType w:val="hybridMultilevel"/>
-    <w:tmpl w:val="B3F0A9C8"/>
-    <w:lvl w:ilvl="0" w:tplc="E29E64B4">
+    <w:tmpl w:val="6D446D38"/>
+    <w:lvl w:ilvl="0" w:tplc="6D5A8502">
+      <w:start w:val="1"/>
+      <w:numFmt w:val="decimal"/>
+      <w:lvlText w:val="%1."/>
+      <w:lvlJc w:val="left"/>
+      <w:pPr>
+        <w:ind w:left="360" w:hanging="300"/>
+      </w:pPr>
+    </w:lvl>
+    <w:lvl w:ilvl="1" w:tplc="16D8B09C" w:tentative="1">
+      <w:start w:val="1"/>
+      <w:numFmt w:val="decimal"/>
+      <w:lvlText w:val="%2."/>
+      <w:lvlJc w:val="left"/>
+      <w:pPr>
+        <w:ind w:left="720" w:hanging="300"/>
+      </w:pPr>
+    </w:lvl>
+    <w:lvl w:ilvl="2" w:tplc="BE543EDE" w:tentative="1">
+      <w:start w:val="1"/>
+      <w:numFmt w:val="decimal"/>
+      <w:lvlText w:val="%3."/>
+      <w:lvlJc w:val="left"/>
+      <w:pPr>
+        <w:ind w:left="1080" w:hanging="300"/>
+      </w:pPr>
+    </w:lvl>
+    <w:lvl w:ilvl="3" w:tplc="3A486C96">
+      <w:numFmt w:val="decimal"/>
+      <w:lvlText w:val=""/>
+      <w:lvlJc w:val="left"/>
+    </w:lvl>
+    <w:lvl w:ilvl="4" w:tplc="4AAC07E8">
+      <w:numFmt w:val="decimal"/>
+      <w:lvlText w:val=""/>
+      <w:lvlJc w:val="left"/>
+    </w:lvl>
+    <w:lvl w:ilvl="5" w:tplc="C854C684">
+      <w:numFmt w:val="decimal"/>
+      <w:lvlText w:val=""/>
+      <w:lvlJc w:val="left"/>
+    </w:lvl>
+    <w:lvl w:ilvl="6" w:tplc="3FCCDAC6">
+      <w:numFmt w:val="decimal"/>
+      <w:lvlText w:val=""/>
+      <w:lvlJc w:val="left"/>
+    </w:lvl>
+    <w:lvl w:ilvl="7" w:tplc="984AD3DA">
+      <w:numFmt w:val="decimal"/>
+      <w:lvlText w:val=""/>
+      <w:lvlJc w:val="left"/>
+    </w:lvl>
+    <w:lvl w:ilvl="8" w:tplc="EF02BFA8">
+      <w:numFmt w:val="decimal"/>
+      <w:lvlText w:val=""/>
+      <w:lvlJc w:val="left"/>
+    </w:lvl>
+  </w:abstractNum>
+  <w:abstractNum w:abstractNumId="1" w15:restartNumberingAfterBreak="0">
+    <w:nsid w:val="3BFF5A78"/>
+    <w:multiLevelType w:val="hybridMultilevel"/>
+    <w:tmpl w:val="F66E97BA"/>
+    <w:lvl w:ilvl="0" w:tplc="5FF492B4">
       <w:start w:val="1"/>
       <w:numFmt w:val="bullet"/>
       <w:lvlText w:val="•"/>
@@ -38406,7 +38468,7 @@
         <w:ind w:left="360" w:hanging="260"/>
       </w:pPr>
     </w:lvl>
-    <w:lvl w:ilvl="1" w:tplc="A782A1BC" w:tentative="1">
+    <w:lvl w:ilvl="1" w:tplc="91448282" w:tentative="1">
       <w:start w:val="1"/>
       <w:numFmt w:val="bullet"/>
       <w:lvlText w:val="◦"/>
@@ -38415,7 +38477,7 @@
         <w:ind w:left="720" w:hanging="260"/>
       </w:pPr>
     </w:lvl>
-    <w:lvl w:ilvl="2" w:tplc="3C76CFCC" w:tentative="1">
+    <w:lvl w:ilvl="2" w:tplc="16AE8D0A" w:tentative="1">
       <w:start w:val="1"/>
       <w:numFmt w:val="bullet"/>
       <w:lvlText w:val="▪"/>
@@ -38424,104 +38486,42 @@
         <w:ind w:left="1080" w:hanging="260"/>
       </w:pPr>
     </w:lvl>
-    <w:lvl w:ilvl="3" w:tplc="76F41230">
+    <w:lvl w:ilvl="3" w:tplc="4E58D54A">
       <w:numFmt w:val="decimal"/>
       <w:lvlText w:val=""/>
       <w:lvlJc w:val="left"/>
     </w:lvl>
-    <w:lvl w:ilvl="4" w:tplc="206AC918">
+    <w:lvl w:ilvl="4" w:tplc="393409DA">
       <w:numFmt w:val="decimal"/>
       <w:lvlText w:val=""/>
       <w:lvlJc w:val="left"/>
     </w:lvl>
-    <w:lvl w:ilvl="5" w:tplc="486E27E4">
+    <w:lvl w:ilvl="5" w:tplc="5F0EEF20">
       <w:numFmt w:val="decimal"/>
       <w:lvlText w:val=""/>
       <w:lvlJc w:val="left"/>
     </w:lvl>
-    <w:lvl w:ilvl="6" w:tplc="BE3E0C28">
+    <w:lvl w:ilvl="6" w:tplc="4FEC63FA">
       <w:numFmt w:val="decimal"/>
       <w:lvlText w:val=""/>
       <w:lvlJc w:val="left"/>
     </w:lvl>
-    <w:lvl w:ilvl="7" w:tplc="D9705174">
+    <w:lvl w:ilvl="7" w:tplc="C950896A">
       <w:numFmt w:val="decimal"/>
       <w:lvlText w:val=""/>
       <w:lvlJc w:val="left"/>
     </w:lvl>
-    <w:lvl w:ilvl="8" w:tplc="3DAC6596">
-      <w:numFmt w:val="decimal"/>
-      <w:lvlText w:val=""/>
-      <w:lvlJc w:val="left"/>
-    </w:lvl>
-  </w:abstractNum>
-  <w:abstractNum w:abstractNumId="1" w15:restartNumberingAfterBreak="0">
-    <w:nsid w:val="1CFE6BEC"/>
-    <w:multiLevelType w:val="hybridMultilevel"/>
-    <w:tmpl w:val="0B1A4152"/>
-    <w:lvl w:ilvl="0" w:tplc="7B3AEC8A">
-      <w:start w:val="1"/>
-      <w:numFmt w:val="decimal"/>
-      <w:lvlText w:val="%1."/>
-      <w:lvlJc w:val="left"/>
-      <w:pPr>
-        <w:ind w:left="360" w:hanging="300"/>
-      </w:pPr>
-    </w:lvl>
-    <w:lvl w:ilvl="1" w:tplc="1EEEE40E" w:tentative="1">
-      <w:start w:val="1"/>
-      <w:numFmt w:val="decimal"/>
-      <w:lvlText w:val="%2."/>
-      <w:lvlJc w:val="left"/>
-      <w:pPr>
-        <w:ind w:left="720" w:hanging="300"/>
-      </w:pPr>
-    </w:lvl>
-    <w:lvl w:ilvl="2" w:tplc="9E9C5924" w:tentative="1">
-      <w:start w:val="1"/>
-      <w:numFmt w:val="decimal"/>
-      <w:lvlText w:val="%3."/>
-      <w:lvlJc w:val="left"/>
-      <w:pPr>
-        <w:ind w:left="1080" w:hanging="300"/>
-      </w:pPr>
-    </w:lvl>
-    <w:lvl w:ilvl="3" w:tplc="3430A304">
-      <w:numFmt w:val="decimal"/>
-      <w:lvlText w:val=""/>
-      <w:lvlJc w:val="left"/>
-    </w:lvl>
-    <w:lvl w:ilvl="4" w:tplc="51CA449A">
-      <w:numFmt w:val="decimal"/>
-      <w:lvlText w:val=""/>
-      <w:lvlJc w:val="left"/>
-    </w:lvl>
-    <w:lvl w:ilvl="5" w:tplc="50F4FFF0">
-      <w:numFmt w:val="decimal"/>
-      <w:lvlText w:val=""/>
-      <w:lvlJc w:val="left"/>
-    </w:lvl>
-    <w:lvl w:ilvl="6" w:tplc="20C0B8F6">
-      <w:numFmt w:val="decimal"/>
-      <w:lvlText w:val=""/>
-      <w:lvlJc w:val="left"/>
-    </w:lvl>
-    <w:lvl w:ilvl="7" w:tplc="4FC0EC18">
-      <w:numFmt w:val="decimal"/>
-      <w:lvlText w:val=""/>
-      <w:lvlJc w:val="left"/>
-    </w:lvl>
-    <w:lvl w:ilvl="8" w:tplc="FCAE333A">
+    <w:lvl w:ilvl="8" w:tplc="2DE4DCE0">
       <w:numFmt w:val="decimal"/>
       <w:lvlText w:val=""/>
       <w:lvlJc w:val="left"/>
     </w:lvl>
   </w:abstractNum>
   <w:abstractNum w:abstractNumId="2" w15:restartNumberingAfterBreak="0">
-    <w:nsid w:val="2D484FE9"/>
+    <w:nsid w:val="712432CF"/>
     <w:multiLevelType w:val="hybridMultilevel"/>
-    <w:tmpl w:val="58541444"/>
-    <w:lvl w:ilvl="0" w:tplc="B468AC82" w:tentative="1">
+    <w:tmpl w:val="CAB2849C"/>
+    <w:lvl w:ilvl="0" w:tplc="B7C22E60" w:tentative="1">
       <w:start w:val="1"/>
       <w:numFmt w:val="bullet"/>
       <w:lvlText w:val="●"/>
@@ -38530,7 +38530,7 @@
         <w:ind w:left="720" w:hanging="360"/>
       </w:pPr>
     </w:lvl>
-    <w:lvl w:ilvl="1" w:tplc="75223C68" w:tentative="1">
+    <w:lvl w:ilvl="1" w:tplc="83168910" w:tentative="1">
       <w:start w:val="1"/>
       <w:numFmt w:val="bullet"/>
       <w:lvlText w:val="○"/>
@@ -38539,7 +38539,7 @@
         <w:ind w:left="1440" w:hanging="360"/>
       </w:pPr>
     </w:lvl>
-    <w:lvl w:ilvl="2" w:tplc="CAD00F56" w:tentative="1">
+    <w:lvl w:ilvl="2" w:tplc="BD5E7724" w:tentative="1">
       <w:start w:val="1"/>
       <w:numFmt w:val="bullet"/>
       <w:lvlText w:val="■"/>
@@ -38548,7 +38548,7 @@
         <w:ind w:left="2160" w:hanging="360"/>
       </w:pPr>
     </w:lvl>
-    <w:lvl w:ilvl="3" w:tplc="DAC06FB4" w:tentative="1">
+    <w:lvl w:ilvl="3" w:tplc="FD7AC3EA" w:tentative="1">
       <w:start w:val="1"/>
       <w:numFmt w:val="bullet"/>
       <w:lvlText w:val="●"/>
@@ -38557,7 +38557,7 @@
         <w:ind w:left="2880" w:hanging="360"/>
       </w:pPr>
     </w:lvl>
-    <w:lvl w:ilvl="4" w:tplc="B5B2E0E2" w:tentative="1">
+    <w:lvl w:ilvl="4" w:tplc="599E7908" w:tentative="1">
       <w:start w:val="1"/>
       <w:numFmt w:val="bullet"/>
       <w:lvlText w:val="○"/>
@@ -38566,7 +38566,7 @@
         <w:ind w:left="3600" w:hanging="360"/>
       </w:pPr>
     </w:lvl>
-    <w:lvl w:ilvl="5" w:tplc="D90C5E52" w:tentative="1">
+    <w:lvl w:ilvl="5" w:tplc="97EA58E0" w:tentative="1">
       <w:start w:val="1"/>
       <w:numFmt w:val="bullet"/>
       <w:lvlText w:val="■"/>
@@ -38575,7 +38575,7 @@
         <w:ind w:left="4320" w:hanging="360"/>
       </w:pPr>
     </w:lvl>
-    <w:lvl w:ilvl="6" w:tplc="C704796E" w:tentative="1">
+    <w:lvl w:ilvl="6" w:tplc="E9F03670" w:tentative="1">
       <w:start w:val="1"/>
       <w:numFmt w:val="bullet"/>
       <w:lvlText w:val="●"/>
@@ -38584,7 +38584,7 @@
         <w:ind w:left="5040" w:hanging="360"/>
       </w:pPr>
     </w:lvl>
-    <w:lvl w:ilvl="7" w:tplc="079A0178" w:tentative="1">
+    <w:lvl w:ilvl="7" w:tplc="C8ECBF24" w:tentative="1">
       <w:start w:val="1"/>
       <w:numFmt w:val="bullet"/>
       <w:lvlText w:val="●"/>
@@ -38593,7 +38593,7 @@
         <w:ind w:left="5760" w:hanging="360"/>
       </w:pPr>
     </w:lvl>
-    <w:lvl w:ilvl="8" w:tplc="A10E4448" w:tentative="1">
+    <w:lvl w:ilvl="8" w:tplc="4BC67C3E" w:tentative="1">
       <w:start w:val="1"/>
       <w:numFmt w:val="bullet"/>
       <w:lvlText w:val="●"/>
@@ -38603,14 +38603,14 @@
       </w:pPr>
     </w:lvl>
   </w:abstractNum>
-  <w:num w:numId="1" w16cid:durableId="306475436">
+  <w:num w:numId="1" w16cid:durableId="1818448811">
     <w:abstractNumId w:val="2"/>
     <w:lvlOverride w:ilvl="0">
       <w:startOverride w:val="1"/>
     </w:lvlOverride>
   </w:num>
-  <w:num w:numId="2" w16cid:durableId="671949461">
-    <w:abstractNumId w:val="1"/>
+  <w:num w:numId="2" w16cid:durableId="430979805">
+    <w:abstractNumId w:val="0"/>
     <w:lvlOverride w:ilvl="0">
       <w:startOverride w:val="1"/>
     </w:lvlOverride>
@@ -38621,8 +38621,8 @@
       <w:startOverride w:val="1"/>
     </w:lvlOverride>
   </w:num>
-  <w:num w:numId="3" w16cid:durableId="1709139121">
-    <w:abstractNumId w:val="1"/>
+  <w:num w:numId="3" w16cid:durableId="144711706">
+    <w:abstractNumId w:val="0"/>
     <w:lvlOverride w:ilvl="0">
       <w:startOverride w:val="1"/>
     </w:lvlOverride>
@@ -38633,8 +38633,8 @@
       <w:startOverride w:val="1"/>
     </w:lvlOverride>
   </w:num>
-  <w:num w:numId="4" w16cid:durableId="1190869993">
-    <w:abstractNumId w:val="0"/>
+  <w:num w:numId="4" w16cid:durableId="1168249472">
+    <w:abstractNumId w:val="1"/>
     <w:lvlOverride w:ilvl="0">
       <w:startOverride w:val="1"/>
     </w:lvlOverride>

</xml_diff>

<commit_message>
Clean up repo and add COMMANDS.md
- COMMANDS.md: every run command with what it runs (headless, headed,
  slow motion, UI and debug mode, one browser, one test, areas, suites,
  reports, checks); each command verified
- docs/RUNNING.md reduced to settings and tags (no duplicate command list);
  stale "@DEF-xx @fail" tag row corrected
- Removed three intermediate run logs that no document referred to;
  evidence/README.md lists what each remaining log shows
- README and submission document point to COMMANDS.md

Co-Authored-By: Claude Opus 5.5 <noreply@anthropic.com>
</commit_message>
<xml_diff>
--- a/submission/Chandramouli_Kancharla_QA_Automation_Assessment.docx
+++ b/submission/Chandramouli_Kancharla_QA_Automation_Assessment.docx
@@ -445,7 +445,7 @@
     <w:sdt>
       <w:sdtPr>
         <w:alias w:val="Contents"/>
-        <w:id w:val="-294374270"/>
+        <w:id w:val="-1598632325"/>
         <w:docPartObj>
           <w:docPartGallery w:val="Table of Contents"/>
           <w:docPartUnique/>
@@ -477,7 +477,7 @@
           <w:r>
             <w:fldChar w:fldCharType="separate"/>
           </w:r>
-          <w:hyperlink w:anchor="_Toc244105093" w:history="1">
+          <w:hyperlink w:anchor="_Toc244105963" w:history="1">
             <w:r>
               <w:rPr>
                 <w:rStyle w:val="Hyperlink"/>
@@ -501,7 +501,7 @@
               <w:rPr>
                 <w:noProof/>
               </w:rPr>
-              <w:instrText xml:space="preserve"> PAGEREF _Toc244105093 \h </w:instrText>
+              <w:instrText xml:space="preserve"> PAGEREF _Toc244105963 \h </w:instrText>
             </w:r>
             <w:r>
               <w:rPr>
@@ -543,7 +543,7 @@
               <w14:ligatures w14:val="standardContextual"/>
             </w:rPr>
           </w:pPr>
-          <w:hyperlink w:anchor="_Toc244105094" w:history="1">
+          <w:hyperlink w:anchor="_Toc244105964" w:history="1">
             <w:r>
               <w:rPr>
                 <w:rStyle w:val="Hyperlink"/>
@@ -567,7 +567,7 @@
               <w:rPr>
                 <w:noProof/>
               </w:rPr>
-              <w:instrText xml:space="preserve"> PAGEREF _Toc244105094 \h </w:instrText>
+              <w:instrText xml:space="preserve"> PAGEREF _Toc244105964 \h </w:instrText>
             </w:r>
             <w:r>
               <w:rPr>
@@ -609,7 +609,7 @@
               <w14:ligatures w14:val="standardContextual"/>
             </w:rPr>
           </w:pPr>
-          <w:hyperlink w:anchor="_Toc244105095" w:history="1">
+          <w:hyperlink w:anchor="_Toc244105965" w:history="1">
             <w:r>
               <w:rPr>
                 <w:rStyle w:val="Hyperlink"/>
@@ -633,7 +633,7 @@
               <w:rPr>
                 <w:noProof/>
               </w:rPr>
-              <w:instrText xml:space="preserve"> PAGEREF _Toc244105095 \h </w:instrText>
+              <w:instrText xml:space="preserve"> PAGEREF _Toc244105965 \h </w:instrText>
             </w:r>
             <w:r>
               <w:rPr>
@@ -675,7 +675,7 @@
               <w14:ligatures w14:val="standardContextual"/>
             </w:rPr>
           </w:pPr>
-          <w:hyperlink w:anchor="_Toc244105096" w:history="1">
+          <w:hyperlink w:anchor="_Toc244105966" w:history="1">
             <w:r>
               <w:rPr>
                 <w:rStyle w:val="Hyperlink"/>
@@ -699,7 +699,7 @@
               <w:rPr>
                 <w:noProof/>
               </w:rPr>
-              <w:instrText xml:space="preserve"> PAGEREF _Toc244105096 \h </w:instrText>
+              <w:instrText xml:space="preserve"> PAGEREF _Toc244105966 \h </w:instrText>
             </w:r>
             <w:r>
               <w:rPr>
@@ -741,7 +741,7 @@
               <w14:ligatures w14:val="standardContextual"/>
             </w:rPr>
           </w:pPr>
-          <w:hyperlink w:anchor="_Toc244105097" w:history="1">
+          <w:hyperlink w:anchor="_Toc244105967" w:history="1">
             <w:r>
               <w:rPr>
                 <w:rStyle w:val="Hyperlink"/>
@@ -765,7 +765,7 @@
               <w:rPr>
                 <w:noProof/>
               </w:rPr>
-              <w:instrText xml:space="preserve"> PAGEREF _Toc244105097 \h </w:instrText>
+              <w:instrText xml:space="preserve"> PAGEREF _Toc244105967 \h </w:instrText>
             </w:r>
             <w:r>
               <w:rPr>
@@ -807,7 +807,7 @@
               <w14:ligatures w14:val="standardContextual"/>
             </w:rPr>
           </w:pPr>
-          <w:hyperlink w:anchor="_Toc244105098" w:history="1">
+          <w:hyperlink w:anchor="_Toc244105968" w:history="1">
             <w:r>
               <w:rPr>
                 <w:rStyle w:val="Hyperlink"/>
@@ -831,7 +831,7 @@
               <w:rPr>
                 <w:noProof/>
               </w:rPr>
-              <w:instrText xml:space="preserve"> PAGEREF _Toc244105098 \h </w:instrText>
+              <w:instrText xml:space="preserve"> PAGEREF _Toc244105968 \h </w:instrText>
             </w:r>
             <w:r>
               <w:rPr>
@@ -873,7 +873,7 @@
               <w14:ligatures w14:val="standardContextual"/>
             </w:rPr>
           </w:pPr>
-          <w:hyperlink w:anchor="_Toc244105099" w:history="1">
+          <w:hyperlink w:anchor="_Toc244105969" w:history="1">
             <w:r>
               <w:rPr>
                 <w:rStyle w:val="Hyperlink"/>
@@ -897,7 +897,7 @@
               <w:rPr>
                 <w:noProof/>
               </w:rPr>
-              <w:instrText xml:space="preserve"> PAGEREF _Toc244105099 \h </w:instrText>
+              <w:instrText xml:space="preserve"> PAGEREF _Toc244105969 \h </w:instrText>
             </w:r>
             <w:r>
               <w:rPr>
@@ -939,7 +939,7 @@
               <w14:ligatures w14:val="standardContextual"/>
             </w:rPr>
           </w:pPr>
-          <w:hyperlink w:anchor="_Toc244105100" w:history="1">
+          <w:hyperlink w:anchor="_Toc244105970" w:history="1">
             <w:r>
               <w:rPr>
                 <w:rStyle w:val="Hyperlink"/>
@@ -963,7 +963,7 @@
               <w:rPr>
                 <w:noProof/>
               </w:rPr>
-              <w:instrText xml:space="preserve"> PAGEREF _Toc244105100 \h </w:instrText>
+              <w:instrText xml:space="preserve"> PAGEREF _Toc244105970 \h </w:instrText>
             </w:r>
             <w:r>
               <w:rPr>
@@ -1005,7 +1005,7 @@
               <w14:ligatures w14:val="standardContextual"/>
             </w:rPr>
           </w:pPr>
-          <w:hyperlink w:anchor="_Toc244105101" w:history="1">
+          <w:hyperlink w:anchor="_Toc244105971" w:history="1">
             <w:r>
               <w:rPr>
                 <w:rStyle w:val="Hyperlink"/>
@@ -1029,7 +1029,7 @@
               <w:rPr>
                 <w:noProof/>
               </w:rPr>
-              <w:instrText xml:space="preserve"> PAGEREF _Toc244105101 \h </w:instrText>
+              <w:instrText xml:space="preserve"> PAGEREF _Toc244105971 \h </w:instrText>
             </w:r>
             <w:r>
               <w:rPr>
@@ -1071,7 +1071,7 @@
               <w14:ligatures w14:val="standardContextual"/>
             </w:rPr>
           </w:pPr>
-          <w:hyperlink w:anchor="_Toc244105102" w:history="1">
+          <w:hyperlink w:anchor="_Toc244105972" w:history="1">
             <w:r>
               <w:rPr>
                 <w:rStyle w:val="Hyperlink"/>
@@ -1095,7 +1095,7 @@
               <w:rPr>
                 <w:noProof/>
               </w:rPr>
-              <w:instrText xml:space="preserve"> PAGEREF _Toc244105102 \h </w:instrText>
+              <w:instrText xml:space="preserve"> PAGEREF _Toc244105972 \h </w:instrText>
             </w:r>
             <w:r>
               <w:rPr>
@@ -1137,7 +1137,7 @@
               <w14:ligatures w14:val="standardContextual"/>
             </w:rPr>
           </w:pPr>
-          <w:hyperlink w:anchor="_Toc244105103" w:history="1">
+          <w:hyperlink w:anchor="_Toc244105973" w:history="1">
             <w:r>
               <w:rPr>
                 <w:rStyle w:val="Hyperlink"/>
@@ -1161,7 +1161,7 @@
               <w:rPr>
                 <w:noProof/>
               </w:rPr>
-              <w:instrText xml:space="preserve"> PAGEREF _Toc244105103 \h </w:instrText>
+              <w:instrText xml:space="preserve"> PAGEREF _Toc244105973 \h </w:instrText>
             </w:r>
             <w:r>
               <w:rPr>
@@ -1203,7 +1203,7 @@
               <w14:ligatures w14:val="standardContextual"/>
             </w:rPr>
           </w:pPr>
-          <w:hyperlink w:anchor="_Toc244105104" w:history="1">
+          <w:hyperlink w:anchor="_Toc244105974" w:history="1">
             <w:r>
               <w:rPr>
                 <w:rStyle w:val="Hyperlink"/>
@@ -1227,7 +1227,7 @@
               <w:rPr>
                 <w:noProof/>
               </w:rPr>
-              <w:instrText xml:space="preserve"> PAGEREF _Toc244105104 \h </w:instrText>
+              <w:instrText xml:space="preserve"> PAGEREF _Toc244105974 \h </w:instrText>
             </w:r>
             <w:r>
               <w:rPr>
@@ -1244,7 +1244,7 @@
               <w:rPr>
                 <w:noProof/>
               </w:rPr>
-              <w:t>9</w:t>
+              <w:t>10</w:t>
             </w:r>
             <w:r>
               <w:rPr>
@@ -1269,7 +1269,7 @@
               <w14:ligatures w14:val="standardContextual"/>
             </w:rPr>
           </w:pPr>
-          <w:hyperlink w:anchor="_Toc244105105" w:history="1">
+          <w:hyperlink w:anchor="_Toc244105975" w:history="1">
             <w:r>
               <w:rPr>
                 <w:rStyle w:val="Hyperlink"/>
@@ -1293,7 +1293,7 @@
               <w:rPr>
                 <w:noProof/>
               </w:rPr>
-              <w:instrText xml:space="preserve"> PAGEREF _Toc244105105 \h </w:instrText>
+              <w:instrText xml:space="preserve"> PAGEREF _Toc244105975 \h </w:instrText>
             </w:r>
             <w:r>
               <w:rPr>
@@ -1310,7 +1310,7 @@
               <w:rPr>
                 <w:noProof/>
               </w:rPr>
-              <w:t>10</w:t>
+              <w:t>11</w:t>
             </w:r>
             <w:r>
               <w:rPr>
@@ -1335,7 +1335,7 @@
               <w14:ligatures w14:val="standardContextual"/>
             </w:rPr>
           </w:pPr>
-          <w:hyperlink w:anchor="_Toc244105106" w:history="1">
+          <w:hyperlink w:anchor="_Toc244105976" w:history="1">
             <w:r>
               <w:rPr>
                 <w:rStyle w:val="Hyperlink"/>
@@ -1359,7 +1359,7 @@
               <w:rPr>
                 <w:noProof/>
               </w:rPr>
-              <w:instrText xml:space="preserve"> PAGEREF _Toc244105106 \h </w:instrText>
+              <w:instrText xml:space="preserve"> PAGEREF _Toc244105976 \h </w:instrText>
             </w:r>
             <w:r>
               <w:rPr>
@@ -1376,7 +1376,7 @@
               <w:rPr>
                 <w:noProof/>
               </w:rPr>
-              <w:t>11</w:t>
+              <w:t>12</w:t>
             </w:r>
             <w:r>
               <w:rPr>
@@ -1401,7 +1401,7 @@
               <w14:ligatures w14:val="standardContextual"/>
             </w:rPr>
           </w:pPr>
-          <w:hyperlink w:anchor="_Toc244105107" w:history="1">
+          <w:hyperlink w:anchor="_Toc244105977" w:history="1">
             <w:r>
               <w:rPr>
                 <w:rStyle w:val="Hyperlink"/>
@@ -1425,7 +1425,7 @@
               <w:rPr>
                 <w:noProof/>
               </w:rPr>
-              <w:instrText xml:space="preserve"> PAGEREF _Toc244105107 \h </w:instrText>
+              <w:instrText xml:space="preserve"> PAGEREF _Toc244105977 \h </w:instrText>
             </w:r>
             <w:r>
               <w:rPr>
@@ -1442,7 +1442,7 @@
               <w:rPr>
                 <w:noProof/>
               </w:rPr>
-              <w:t>12</w:t>
+              <w:t>13</w:t>
             </w:r>
             <w:r>
               <w:rPr>
@@ -1467,7 +1467,7 @@
               <w14:ligatures w14:val="standardContextual"/>
             </w:rPr>
           </w:pPr>
-          <w:hyperlink w:anchor="_Toc244105108" w:history="1">
+          <w:hyperlink w:anchor="_Toc244105978" w:history="1">
             <w:r>
               <w:rPr>
                 <w:rStyle w:val="Hyperlink"/>
@@ -1491,7 +1491,7 @@
               <w:rPr>
                 <w:noProof/>
               </w:rPr>
-              <w:instrText xml:space="preserve"> PAGEREF _Toc244105108 \h </w:instrText>
+              <w:instrText xml:space="preserve"> PAGEREF _Toc244105978 \h </w:instrText>
             </w:r>
             <w:r>
               <w:rPr>
@@ -1508,7 +1508,7 @@
               <w:rPr>
                 <w:noProof/>
               </w:rPr>
-              <w:t>14</w:t>
+              <w:t>15</w:t>
             </w:r>
             <w:r>
               <w:rPr>
@@ -1533,7 +1533,7 @@
               <w14:ligatures w14:val="standardContextual"/>
             </w:rPr>
           </w:pPr>
-          <w:hyperlink w:anchor="_Toc244105109" w:history="1">
+          <w:hyperlink w:anchor="_Toc244105979" w:history="1">
             <w:r>
               <w:rPr>
                 <w:rStyle w:val="Hyperlink"/>
@@ -1557,7 +1557,7 @@
               <w:rPr>
                 <w:noProof/>
               </w:rPr>
-              <w:instrText xml:space="preserve"> PAGEREF _Toc244105109 \h </w:instrText>
+              <w:instrText xml:space="preserve"> PAGEREF _Toc244105979 \h </w:instrText>
             </w:r>
             <w:r>
               <w:rPr>
@@ -1574,7 +1574,7 @@
               <w:rPr>
                 <w:noProof/>
               </w:rPr>
-              <w:t>14</w:t>
+              <w:t>15</w:t>
             </w:r>
             <w:r>
               <w:rPr>
@@ -1599,7 +1599,7 @@
               <w14:ligatures w14:val="standardContextual"/>
             </w:rPr>
           </w:pPr>
-          <w:hyperlink w:anchor="_Toc244105110" w:history="1">
+          <w:hyperlink w:anchor="_Toc244105980" w:history="1">
             <w:r>
               <w:rPr>
                 <w:rStyle w:val="Hyperlink"/>
@@ -1623,7 +1623,7 @@
               <w:rPr>
                 <w:noProof/>
               </w:rPr>
-              <w:instrText xml:space="preserve"> PAGEREF _Toc244105110 \h </w:instrText>
+              <w:instrText xml:space="preserve"> PAGEREF _Toc244105980 \h </w:instrText>
             </w:r>
             <w:r>
               <w:rPr>
@@ -1640,7 +1640,7 @@
               <w:rPr>
                 <w:noProof/>
               </w:rPr>
-              <w:t>15</w:t>
+              <w:t>16</w:t>
             </w:r>
             <w:r>
               <w:rPr>
@@ -1665,7 +1665,7 @@
               <w14:ligatures w14:val="standardContextual"/>
             </w:rPr>
           </w:pPr>
-          <w:hyperlink w:anchor="_Toc244105111" w:history="1">
+          <w:hyperlink w:anchor="_Toc244105981" w:history="1">
             <w:r>
               <w:rPr>
                 <w:rStyle w:val="Hyperlink"/>
@@ -1689,7 +1689,7 @@
               <w:rPr>
                 <w:noProof/>
               </w:rPr>
-              <w:instrText xml:space="preserve"> PAGEREF _Toc244105111 \h </w:instrText>
+              <w:instrText xml:space="preserve"> PAGEREF _Toc244105981 \h </w:instrText>
             </w:r>
             <w:r>
               <w:rPr>
@@ -1706,7 +1706,7 @@
               <w:rPr>
                 <w:noProof/>
               </w:rPr>
-              <w:t>16</w:t>
+              <w:t>17</w:t>
             </w:r>
             <w:r>
               <w:rPr>
@@ -1731,7 +1731,7 @@
               <w14:ligatures w14:val="standardContextual"/>
             </w:rPr>
           </w:pPr>
-          <w:hyperlink w:anchor="_Toc244105112" w:history="1">
+          <w:hyperlink w:anchor="_Toc244105982" w:history="1">
             <w:r>
               <w:rPr>
                 <w:rStyle w:val="Hyperlink"/>
@@ -1755,7 +1755,7 @@
               <w:rPr>
                 <w:noProof/>
               </w:rPr>
-              <w:instrText xml:space="preserve"> PAGEREF _Toc244105112 \h </w:instrText>
+              <w:instrText xml:space="preserve"> PAGEREF _Toc244105982 \h </w:instrText>
             </w:r>
             <w:r>
               <w:rPr>
@@ -1772,7 +1772,7 @@
               <w:rPr>
                 <w:noProof/>
               </w:rPr>
-              <w:t>16</w:t>
+              <w:t>17</w:t>
             </w:r>
             <w:r>
               <w:rPr>
@@ -1797,7 +1797,7 @@
               <w14:ligatures w14:val="standardContextual"/>
             </w:rPr>
           </w:pPr>
-          <w:hyperlink w:anchor="_Toc244105113" w:history="1">
+          <w:hyperlink w:anchor="_Toc244105983" w:history="1">
             <w:r>
               <w:rPr>
                 <w:rStyle w:val="Hyperlink"/>
@@ -1821,7 +1821,7 @@
               <w:rPr>
                 <w:noProof/>
               </w:rPr>
-              <w:instrText xml:space="preserve"> PAGEREF _Toc244105113 \h </w:instrText>
+              <w:instrText xml:space="preserve"> PAGEREF _Toc244105983 \h </w:instrText>
             </w:r>
             <w:r>
               <w:rPr>
@@ -1838,7 +1838,7 @@
               <w:rPr>
                 <w:noProof/>
               </w:rPr>
-              <w:t>16</w:t>
+              <w:t>17</w:t>
             </w:r>
             <w:r>
               <w:rPr>
@@ -1863,7 +1863,7 @@
               <w14:ligatures w14:val="standardContextual"/>
             </w:rPr>
           </w:pPr>
-          <w:hyperlink w:anchor="_Toc244105114" w:history="1">
+          <w:hyperlink w:anchor="_Toc244105984" w:history="1">
             <w:r>
               <w:rPr>
                 <w:rStyle w:val="Hyperlink"/>
@@ -1887,7 +1887,7 @@
               <w:rPr>
                 <w:noProof/>
               </w:rPr>
-              <w:instrText xml:space="preserve"> PAGEREF _Toc244105114 \h </w:instrText>
+              <w:instrText xml:space="preserve"> PAGEREF _Toc244105984 \h </w:instrText>
             </w:r>
             <w:r>
               <w:rPr>
@@ -1904,7 +1904,7 @@
               <w:rPr>
                 <w:noProof/>
               </w:rPr>
-              <w:t>17</w:t>
+              <w:t>18</w:t>
             </w:r>
             <w:r>
               <w:rPr>
@@ -1929,7 +1929,7 @@
               <w14:ligatures w14:val="standardContextual"/>
             </w:rPr>
           </w:pPr>
-          <w:hyperlink w:anchor="_Toc244105115" w:history="1">
+          <w:hyperlink w:anchor="_Toc244105985" w:history="1">
             <w:r>
               <w:rPr>
                 <w:rStyle w:val="Hyperlink"/>
@@ -1953,7 +1953,7 @@
               <w:rPr>
                 <w:noProof/>
               </w:rPr>
-              <w:instrText xml:space="preserve"> PAGEREF _Toc244105115 \h </w:instrText>
+              <w:instrText xml:space="preserve"> PAGEREF _Toc244105985 \h </w:instrText>
             </w:r>
             <w:r>
               <w:rPr>
@@ -1970,7 +1970,7 @@
               <w:rPr>
                 <w:noProof/>
               </w:rPr>
-              <w:t>17</w:t>
+              <w:t>18</w:t>
             </w:r>
             <w:r>
               <w:rPr>
@@ -1995,7 +1995,7 @@
               <w14:ligatures w14:val="standardContextual"/>
             </w:rPr>
           </w:pPr>
-          <w:hyperlink w:anchor="_Toc244105116" w:history="1">
+          <w:hyperlink w:anchor="_Toc244105986" w:history="1">
             <w:r>
               <w:rPr>
                 <w:rStyle w:val="Hyperlink"/>
@@ -2019,7 +2019,7 @@
               <w:rPr>
                 <w:noProof/>
               </w:rPr>
-              <w:instrText xml:space="preserve"> PAGEREF _Toc244105116 \h </w:instrText>
+              <w:instrText xml:space="preserve"> PAGEREF _Toc244105986 \h </w:instrText>
             </w:r>
             <w:r>
               <w:rPr>
@@ -2036,7 +2036,7 @@
               <w:rPr>
                 <w:noProof/>
               </w:rPr>
-              <w:t>17</w:t>
+              <w:t>18</w:t>
             </w:r>
             <w:r>
               <w:rPr>
@@ -2061,7 +2061,7 @@
               <w14:ligatures w14:val="standardContextual"/>
             </w:rPr>
           </w:pPr>
-          <w:hyperlink w:anchor="_Toc244105117" w:history="1">
+          <w:hyperlink w:anchor="_Toc244105987" w:history="1">
             <w:r>
               <w:rPr>
                 <w:rStyle w:val="Hyperlink"/>
@@ -2085,7 +2085,7 @@
               <w:rPr>
                 <w:noProof/>
               </w:rPr>
-              <w:instrText xml:space="preserve"> PAGEREF _Toc244105117 \h </w:instrText>
+              <w:instrText xml:space="preserve"> PAGEREF _Toc244105987 \h </w:instrText>
             </w:r>
             <w:r>
               <w:rPr>
@@ -2102,7 +2102,7 @@
               <w:rPr>
                 <w:noProof/>
               </w:rPr>
-              <w:t>17</w:t>
+              <w:t>18</w:t>
             </w:r>
             <w:r>
               <w:rPr>
@@ -2127,7 +2127,7 @@
               <w14:ligatures w14:val="standardContextual"/>
             </w:rPr>
           </w:pPr>
-          <w:hyperlink w:anchor="_Toc244105118" w:history="1">
+          <w:hyperlink w:anchor="_Toc244105988" w:history="1">
             <w:r>
               <w:rPr>
                 <w:rStyle w:val="Hyperlink"/>
@@ -2151,7 +2151,7 @@
               <w:rPr>
                 <w:noProof/>
               </w:rPr>
-              <w:instrText xml:space="preserve"> PAGEREF _Toc244105118 \h </w:instrText>
+              <w:instrText xml:space="preserve"> PAGEREF _Toc244105988 \h </w:instrText>
             </w:r>
             <w:r>
               <w:rPr>
@@ -2168,7 +2168,7 @@
               <w:rPr>
                 <w:noProof/>
               </w:rPr>
-              <w:t>18</w:t>
+              <w:t>19</w:t>
             </w:r>
             <w:r>
               <w:rPr>
@@ -2193,7 +2193,7 @@
               <w14:ligatures w14:val="standardContextual"/>
             </w:rPr>
           </w:pPr>
-          <w:hyperlink w:anchor="_Toc244105119" w:history="1">
+          <w:hyperlink w:anchor="_Toc244105989" w:history="1">
             <w:r>
               <w:rPr>
                 <w:rStyle w:val="Hyperlink"/>
@@ -2217,7 +2217,7 @@
               <w:rPr>
                 <w:noProof/>
               </w:rPr>
-              <w:instrText xml:space="preserve"> PAGEREF _Toc244105119 \h </w:instrText>
+              <w:instrText xml:space="preserve"> PAGEREF _Toc244105989 \h </w:instrText>
             </w:r>
             <w:r>
               <w:rPr>
@@ -2234,7 +2234,7 @@
               <w:rPr>
                 <w:noProof/>
               </w:rPr>
-              <w:t>18</w:t>
+              <w:t>19</w:t>
             </w:r>
             <w:r>
               <w:rPr>
@@ -2259,7 +2259,7 @@
               <w14:ligatures w14:val="standardContextual"/>
             </w:rPr>
           </w:pPr>
-          <w:hyperlink w:anchor="_Toc244105120" w:history="1">
+          <w:hyperlink w:anchor="_Toc244105990" w:history="1">
             <w:r>
               <w:rPr>
                 <w:rStyle w:val="Hyperlink"/>
@@ -2283,7 +2283,7 @@
               <w:rPr>
                 <w:noProof/>
               </w:rPr>
-              <w:instrText xml:space="preserve"> PAGEREF _Toc244105120 \h </w:instrText>
+              <w:instrText xml:space="preserve"> PAGEREF _Toc244105990 \h </w:instrText>
             </w:r>
             <w:r>
               <w:rPr>
@@ -2300,7 +2300,7 @@
               <w:rPr>
                 <w:noProof/>
               </w:rPr>
-              <w:t>19</w:t>
+              <w:t>20</w:t>
             </w:r>
             <w:r>
               <w:rPr>
@@ -2325,7 +2325,7 @@
               <w14:ligatures w14:val="standardContextual"/>
             </w:rPr>
           </w:pPr>
-          <w:hyperlink w:anchor="_Toc244105121" w:history="1">
+          <w:hyperlink w:anchor="_Toc244105991" w:history="1">
             <w:r>
               <w:rPr>
                 <w:rStyle w:val="Hyperlink"/>
@@ -2349,7 +2349,7 @@
               <w:rPr>
                 <w:noProof/>
               </w:rPr>
-              <w:instrText xml:space="preserve"> PAGEREF _Toc244105121 \h </w:instrText>
+              <w:instrText xml:space="preserve"> PAGEREF _Toc244105991 \h </w:instrText>
             </w:r>
             <w:r>
               <w:rPr>
@@ -2366,7 +2366,7 @@
               <w:rPr>
                 <w:noProof/>
               </w:rPr>
-              <w:t>19</w:t>
+              <w:t>20</w:t>
             </w:r>
             <w:r>
               <w:rPr>
@@ -2391,7 +2391,7 @@
               <w14:ligatures w14:val="standardContextual"/>
             </w:rPr>
           </w:pPr>
-          <w:hyperlink w:anchor="_Toc244105122" w:history="1">
+          <w:hyperlink w:anchor="_Toc244105992" w:history="1">
             <w:r>
               <w:rPr>
                 <w:rStyle w:val="Hyperlink"/>
@@ -2415,7 +2415,7 @@
               <w:rPr>
                 <w:noProof/>
               </w:rPr>
-              <w:instrText xml:space="preserve"> PAGEREF _Toc244105122 \h </w:instrText>
+              <w:instrText xml:space="preserve"> PAGEREF _Toc244105992 \h </w:instrText>
             </w:r>
             <w:r>
               <w:rPr>
@@ -2432,7 +2432,7 @@
               <w:rPr>
                 <w:noProof/>
               </w:rPr>
-              <w:t>19</w:t>
+              <w:t>20</w:t>
             </w:r>
             <w:r>
               <w:rPr>
@@ -2457,7 +2457,7 @@
               <w14:ligatures w14:val="standardContextual"/>
             </w:rPr>
           </w:pPr>
-          <w:hyperlink w:anchor="_Toc244105123" w:history="1">
+          <w:hyperlink w:anchor="_Toc244105993" w:history="1">
             <w:r>
               <w:rPr>
                 <w:rStyle w:val="Hyperlink"/>
@@ -2481,7 +2481,7 @@
               <w:rPr>
                 <w:noProof/>
               </w:rPr>
-              <w:instrText xml:space="preserve"> PAGEREF _Toc244105123 \h </w:instrText>
+              <w:instrText xml:space="preserve"> PAGEREF _Toc244105993 \h </w:instrText>
             </w:r>
             <w:r>
               <w:rPr>
@@ -2498,7 +2498,7 @@
               <w:rPr>
                 <w:noProof/>
               </w:rPr>
-              <w:t>19</w:t>
+              <w:t>20</w:t>
             </w:r>
             <w:r>
               <w:rPr>
@@ -2523,7 +2523,7 @@
               <w14:ligatures w14:val="standardContextual"/>
             </w:rPr>
           </w:pPr>
-          <w:hyperlink w:anchor="_Toc244105124" w:history="1">
+          <w:hyperlink w:anchor="_Toc244105994" w:history="1">
             <w:r>
               <w:rPr>
                 <w:rStyle w:val="Hyperlink"/>
@@ -2547,7 +2547,7 @@
               <w:rPr>
                 <w:noProof/>
               </w:rPr>
-              <w:instrText xml:space="preserve"> PAGEREF _Toc244105124 \h </w:instrText>
+              <w:instrText xml:space="preserve"> PAGEREF _Toc244105994 \h </w:instrText>
             </w:r>
             <w:r>
               <w:rPr>
@@ -2564,7 +2564,7 @@
               <w:rPr>
                 <w:noProof/>
               </w:rPr>
-              <w:t>20</w:t>
+              <w:t>21</w:t>
             </w:r>
             <w:r>
               <w:rPr>
@@ -2589,7 +2589,7 @@
               <w14:ligatures w14:val="standardContextual"/>
             </w:rPr>
           </w:pPr>
-          <w:hyperlink w:anchor="_Toc244105125" w:history="1">
+          <w:hyperlink w:anchor="_Toc244105995" w:history="1">
             <w:r>
               <w:rPr>
                 <w:rStyle w:val="Hyperlink"/>
@@ -2613,7 +2613,7 @@
               <w:rPr>
                 <w:noProof/>
               </w:rPr>
-              <w:instrText xml:space="preserve"> PAGEREF _Toc244105125 \h </w:instrText>
+              <w:instrText xml:space="preserve"> PAGEREF _Toc244105995 \h </w:instrText>
             </w:r>
             <w:r>
               <w:rPr>
@@ -2630,7 +2630,7 @@
               <w:rPr>
                 <w:noProof/>
               </w:rPr>
-              <w:t>20</w:t>
+              <w:t>21</w:t>
             </w:r>
             <w:r>
               <w:rPr>
@@ -2656,7 +2656,7 @@
       <w:pPr>
         <w:pStyle w:val="Heading1"/>
       </w:pPr>
-      <w:bookmarkStart w:id="0" w:name="_Toc244105093"/>
+      <w:bookmarkStart w:id="0" w:name="_Toc244105963"/>
       <w:r>
         <w:lastRenderedPageBreak/>
         <w:t>Summary</w:t>
@@ -3855,7 +3855,7 @@
       <w:pPr>
         <w:pStyle w:val="Heading1"/>
       </w:pPr>
-      <w:bookmarkStart w:id="1" w:name="_Toc244105094"/>
+      <w:bookmarkStart w:id="1" w:name="_Toc244105964"/>
       <w:r>
         <w:lastRenderedPageBreak/>
         <w:t>Section A1 — Manual test suite</w:t>
@@ -3866,7 +3866,7 @@
       <w:pPr>
         <w:pStyle w:val="Heading2"/>
       </w:pPr>
-      <w:bookmarkStart w:id="2" w:name="_Toc244105095"/>
+      <w:bookmarkStart w:id="2" w:name="_Toc244105965"/>
       <w:r>
         <w:t>A1.1 Questions for the product owner, and the assumption tested</w:t>
       </w:r>
@@ -4639,7 +4639,7 @@
       <w:pPr>
         <w:pStyle w:val="Heading2"/>
       </w:pPr>
-      <w:bookmarkStart w:id="3" w:name="_Toc244105096"/>
+      <w:bookmarkStart w:id="3" w:name="_Toc244105966"/>
       <w:r>
         <w:lastRenderedPageBreak/>
         <w:t>A1.2 Test cases (25 core cases)</w:t>
@@ -11736,7 +11736,7 @@
       <w:pPr>
         <w:pStyle w:val="Heading2"/>
       </w:pPr>
-      <w:bookmarkStart w:id="4" w:name="_Toc244105097"/>
+      <w:bookmarkStart w:id="4" w:name="_Toc244105967"/>
       <w:r>
         <w:lastRenderedPageBreak/>
         <w:t>A1.3 Exploratory charter — EX-01 (15 minutes, problem_user)</w:t>
@@ -12300,7 +12300,7 @@
       <w:pPr>
         <w:pStyle w:val="Heading2"/>
       </w:pPr>
-      <w:bookmarkStart w:id="5" w:name="_Toc244105098"/>
+      <w:bookmarkStart w:id="5" w:name="_Toc244105968"/>
       <w:r>
         <w:t>A1.4 Strategy (under 150 words)</w:t>
       </w:r>
@@ -12399,7 +12399,7 @@
       <w:pPr>
         <w:pStyle w:val="Heading1"/>
       </w:pPr>
-      <w:bookmarkStart w:id="6" w:name="_Toc244105099"/>
+      <w:bookmarkStart w:id="6" w:name="_Toc244105969"/>
       <w:r>
         <w:lastRenderedPageBreak/>
         <w:t>Section A2 — Automation suite</w:t>
@@ -12418,7 +12418,7 @@
       <w:pPr>
         <w:pStyle w:val="Heading2"/>
       </w:pPr>
-      <w:bookmarkStart w:id="7" w:name="_Toc244105100"/>
+      <w:bookmarkStart w:id="7" w:name="_Toc244105970"/>
       <w:r>
         <w:t>Setup</w:t>
       </w:r>
@@ -12500,7 +12500,7 @@
       <w:pPr>
         <w:pStyle w:val="Heading2"/>
       </w:pPr>
-      <w:bookmarkStart w:id="8" w:name="_Toc244105101"/>
+      <w:bookmarkStart w:id="8" w:name="_Toc244105971"/>
       <w:r>
         <w:t>Running the tests</w:t>
       </w:r>
@@ -13214,14 +13214,21 @@
         <w:t>.feature</w:t>
       </w:r>
       <w:r>
-        <w:t xml:space="preserve"> files into Playwright tests.</w:t>
+        <w:t xml:space="preserve"> files into Playwright tests. </w:t>
+      </w:r>
+      <w:r>
+        <w:rPr>
+          <w:b/>
+          <w:bCs/>
+        </w:rPr>
+        <w:t>All commands, with what each one runs, are in COMMANDS.md.</w:t>
       </w:r>
     </w:p>
     <w:p>
       <w:pPr>
         <w:pStyle w:val="Heading2"/>
       </w:pPr>
-      <w:bookmarkStart w:id="9" w:name="_Toc244105102"/>
+      <w:bookmarkStart w:id="9" w:name="_Toc244105972"/>
       <w:r>
         <w:t>Reports and failure evidence</w:t>
       </w:r>
@@ -13627,7 +13634,7 @@
       <w:pPr>
         <w:pStyle w:val="Heading2"/>
       </w:pPr>
-      <w:bookmarkStart w:id="10" w:name="_Toc244105103"/>
+      <w:bookmarkStart w:id="10" w:name="_Toc244105973"/>
       <w:r>
         <w:t>How the brief's rules are met</w:t>
       </w:r>
@@ -14302,6 +14309,7 @@
                 <w:sz w:val="17"/>
                 <w:szCs w:val="17"/>
               </w:rPr>
+              <w:lastRenderedPageBreak/>
               <w:t>Checks the whole result, not one item</w:t>
             </w:r>
           </w:p>
@@ -14350,7 +14358,7 @@
       <w:pPr>
         <w:pStyle w:val="Heading2"/>
       </w:pPr>
-      <w:bookmarkStart w:id="11" w:name="_Toc244105104"/>
+      <w:bookmarkStart w:id="11" w:name="_Toc244105974"/>
       <w:r>
         <w:lastRenderedPageBreak/>
         <w:t>Manual case → automated test mapping</w:t>
@@ -17531,7 +17539,7 @@
       <w:pPr>
         <w:pStyle w:val="Heading2"/>
       </w:pPr>
-      <w:bookmarkStart w:id="12" w:name="_Toc244105105"/>
+      <w:bookmarkStart w:id="12" w:name="_Toc244105975"/>
       <w:r>
         <w:lastRenderedPageBreak/>
         <w:t>Results</w:t>
@@ -18076,7 +18084,7 @@
       <w:pPr>
         <w:pStyle w:val="Heading2"/>
       </w:pPr>
-      <w:bookmarkStart w:id="13" w:name="_Toc244105106"/>
+      <w:bookmarkStart w:id="13" w:name="_Toc244105976"/>
       <w:r>
         <w:lastRenderedPageBreak/>
         <w:t>Growing the suite to 200 tests</w:t>
@@ -18184,7 +18192,7 @@
       <w:pPr>
         <w:pStyle w:val="Heading1"/>
       </w:pPr>
-      <w:bookmarkStart w:id="14" w:name="_Toc244105107"/>
+      <w:bookmarkStart w:id="14" w:name="_Toc244105977"/>
       <w:r>
         <w:lastRenderedPageBreak/>
         <w:t>Section B1 — Review of the AI-generated cart-total test</w:t>
@@ -21157,7 +21165,7 @@
       <w:pPr>
         <w:pStyle w:val="Heading1"/>
       </w:pPr>
-      <w:bookmarkStart w:id="15" w:name="_Toc244105108"/>
+      <w:bookmarkStart w:id="15" w:name="_Toc244105978"/>
       <w:r>
         <w:t>Section B2 — AI evaluation plan: test case generator</w:t>
       </w:r>
@@ -22126,7 +22134,7 @@
       <w:pPr>
         <w:pStyle w:val="Heading1"/>
       </w:pPr>
-      <w:bookmarkStart w:id="16" w:name="_Toc244105109"/>
+      <w:bookmarkStart w:id="16" w:name="_Toc244105979"/>
       <w:r>
         <w:t>Section B3 — Jira defect report</w:t>
       </w:r>
@@ -22769,7 +22777,7 @@
       <w:pPr>
         <w:pStyle w:val="Heading1"/>
       </w:pPr>
-      <w:bookmarkStart w:id="17" w:name="_Toc244105110"/>
+      <w:bookmarkStart w:id="17" w:name="_Toc244105980"/>
       <w:r>
         <w:t>Section B4 — Message to the client</w:t>
       </w:r>
@@ -22908,7 +22916,7 @@
       <w:pPr>
         <w:pStyle w:val="Heading1"/>
       </w:pPr>
-      <w:bookmarkStart w:id="18" w:name="_Toc244105111"/>
+      <w:bookmarkStart w:id="18" w:name="_Toc244105981"/>
       <w:r>
         <w:lastRenderedPageBreak/>
         <w:t>Section C — Notes for the live discussion</w:t>
@@ -22927,7 +22935,7 @@
       <w:pPr>
         <w:pStyle w:val="Heading2"/>
       </w:pPr>
-      <w:bookmarkStart w:id="19" w:name="_Toc244105112"/>
+      <w:bookmarkStart w:id="19" w:name="_Toc244105982"/>
       <w:r>
         <w:t>C1 — "Checkout has been failing for some users since this morning"</w:t>
       </w:r>
@@ -23137,7 +23145,7 @@
       <w:pPr>
         <w:pStyle w:val="Heading2"/>
       </w:pPr>
-      <w:bookmarkStart w:id="20" w:name="_Toc244105113"/>
+      <w:bookmarkStart w:id="20" w:name="_Toc244105983"/>
       <w:r>
         <w:t>C2 — A recent production issue</w:t>
       </w:r>
@@ -23682,7 +23690,7 @@
       <w:pPr>
         <w:pStyle w:val="Heading1"/>
       </w:pPr>
-      <w:bookmarkStart w:id="21" w:name="_Toc244105114"/>
+      <w:bookmarkStart w:id="21" w:name="_Toc244105984"/>
       <w:r>
         <w:lastRenderedPageBreak/>
         <w:t>AI usage</w:t>
@@ -23701,7 +23709,7 @@
       <w:pPr>
         <w:pStyle w:val="Heading2"/>
       </w:pPr>
-      <w:bookmarkStart w:id="22" w:name="_Toc244105115"/>
+      <w:bookmarkStart w:id="22" w:name="_Toc244105985"/>
       <w:r>
         <w:t>Tool</w:t>
       </w:r>
@@ -23726,7 +23734,7 @@
       <w:pPr>
         <w:pStyle w:val="Heading2"/>
       </w:pPr>
-      <w:bookmarkStart w:id="23" w:name="_Toc244105116"/>
+      <w:bookmarkStart w:id="23" w:name="_Toc244105986"/>
       <w:r>
         <w:t>Where AI was used and what I asked for</w:t>
       </w:r>
@@ -24248,7 +24256,7 @@
       <w:pPr>
         <w:pStyle w:val="Heading2"/>
       </w:pPr>
-      <w:bookmarkStart w:id="24" w:name="_Toc244105117"/>
+      <w:bookmarkStart w:id="24" w:name="_Toc244105987"/>
       <w:r>
         <w:t>AI output I checked and corrected</w:t>
       </w:r>
@@ -25560,7 +25568,7 @@
       <w:pPr>
         <w:pStyle w:val="Heading2"/>
       </w:pPr>
-      <w:bookmarkStart w:id="25" w:name="_Toc244105118"/>
+      <w:bookmarkStart w:id="25" w:name="_Toc244105988"/>
       <w:r>
         <w:t>How the results were verified</w:t>
       </w:r>
@@ -25646,7 +25654,7 @@
       <w:pPr>
         <w:pStyle w:val="Heading2"/>
       </w:pPr>
-      <w:bookmarkStart w:id="26" w:name="_Toc244105119"/>
+      <w:bookmarkStart w:id="26" w:name="_Toc244105989"/>
       <w:r>
         <w:t>My role</w:t>
       </w:r>
@@ -25671,7 +25679,7 @@
       <w:pPr>
         <w:pStyle w:val="Heading1"/>
       </w:pPr>
-      <w:bookmarkStart w:id="27" w:name="_Toc244105120"/>
+      <w:bookmarkStart w:id="27" w:name="_Toc244105990"/>
       <w:r>
         <w:lastRenderedPageBreak/>
         <w:t>Appendix A — Work beyond the brief</w:t>
@@ -25690,7 +25698,7 @@
       <w:pPr>
         <w:pStyle w:val="Heading2"/>
       </w:pPr>
-      <w:bookmarkStart w:id="28" w:name="_Toc244105121"/>
+      <w:bookmarkStart w:id="28" w:name="_Toc244105991"/>
       <w:r>
         <w:t>Extra suites</w:t>
       </w:r>
@@ -26230,7 +26238,7 @@
       <w:pPr>
         <w:pStyle w:val="Heading2"/>
       </w:pPr>
-      <w:bookmarkStart w:id="29" w:name="_Toc244105122"/>
+      <w:bookmarkStart w:id="29" w:name="_Toc244105992"/>
       <w:r>
         <w:t>Whole-suite results (final run, retries 0)</w:t>
       </w:r>
@@ -27098,7 +27106,7 @@
       <w:pPr>
         <w:pStyle w:val="Heading2"/>
       </w:pPr>
-      <w:bookmarkStart w:id="30" w:name="_Toc244105123"/>
+      <w:bookmarkStart w:id="30" w:name="_Toc244105993"/>
       <w:r>
         <w:t>Functional bugs found (Excel sheet "Bugs")</w:t>
       </w:r>
@@ -29377,7 +29385,7 @@
       <w:pPr>
         <w:pStyle w:val="Heading2"/>
       </w:pPr>
-      <w:bookmarkStart w:id="31" w:name="_Toc244105124"/>
+      <w:bookmarkStart w:id="31" w:name="_Toc244105994"/>
       <w:r>
         <w:t>Findings from the automated accessibility and security checks</w:t>
       </w:r>
@@ -29395,7 +29403,7 @@
       <w:pPr>
         <w:pStyle w:val="Heading2"/>
       </w:pPr>
-      <w:bookmarkStart w:id="32" w:name="_Toc244105125"/>
+      <w:bookmarkStart w:id="32" w:name="_Toc244105995"/>
       <w:r>
         <w:t>Extended test cases (TC26–TC98)</w:t>
       </w:r>
@@ -29661,7 +29669,7 @@
         <w:sz w:val="16"/>
         <w:szCs w:val="16"/>
       </w:rPr>
-      <w:t>9</w:t>
+      <w:t>10</w:t>
     </w:r>
     <w:r>
       <w:rPr>
@@ -29720,7 +29728,7 @@
         <w:sz w:val="16"/>
         <w:szCs w:val="16"/>
       </w:rPr>
-      <w:t>11</w:t>
+      <w:t>12</w:t>
     </w:r>
     <w:r>
       <w:rPr>
@@ -29779,7 +29787,7 @@
         <w:sz w:val="16"/>
         <w:szCs w:val="16"/>
       </w:rPr>
-      <w:t>19</w:t>
+      <w:t>20</w:t>
     </w:r>
     <w:r>
       <w:rPr>
@@ -29815,134 +29823,10 @@
 <file path=word/numbering.xml><?xml version="1.0" encoding="utf-8"?>
 <w:numbering xmlns:wpc="http://schemas.microsoft.com/office/word/2010/wordprocessingCanvas" xmlns:cx="http://schemas.microsoft.com/office/drawing/2014/chartex" xmlns:cx1="http://schemas.microsoft.com/office/drawing/2015/9/8/chartex" xmlns:cx2="http://schemas.microsoft.com/office/drawing/2015/10/21/chartex" xmlns:cx3="http://schemas.microsoft.com/office/drawing/2016/5/9/chartex" xmlns:cx4="http://schemas.microsoft.com/office/drawing/2016/5/10/chartex" xmlns:cx5="http://schemas.microsoft.com/office/drawing/2016/5/11/chartex" xmlns:cx6="http://schemas.microsoft.com/office/drawing/2016/5/12/chartex" xmlns:cx7="http://schemas.microsoft.com/office/drawing/2016/5/13/chartex" xmlns:cx8="http://schemas.microsoft.com/office/drawing/2016/5/14/chartex" xmlns:mc="http://schemas.openxmlformats.org/markup-compatibility/2006" xmlns:aink="http://schemas.microsoft.com/office/drawing/2016/ink" xmlns:am3d="http://schemas.microsoft.com/office/drawing/2017/model3d" xmlns:o="urn:schemas-microsoft-com:office:office" xmlns:oel="http://schemas.microsoft.com/office/2019/extlst" xmlns:r="http://schemas.openxmlformats.org/officeDocument/2006/relationships" xmlns:m="http://schemas.openxmlformats.org/officeDocument/2006/math" xmlns:v="urn:schemas-microsoft-com:vml" xmlns:wp14="http://schemas.microsoft.com/office/word/2010/wordprocessingDrawing" xmlns:wp="http://schemas.openxmlformats.org/drawingml/2006/wordprocessingDrawing" xmlns:w10="urn:schemas-microsoft-com:office:word" xmlns:w="http://schemas.openxmlformats.org/wordprocessingml/2006/main" xmlns:w14="http://schemas.microsoft.com/office/word/2010/wordml" xmlns:w15="http://schemas.microsoft.com/office/word/2012/wordml" xmlns:w16cex="http://schemas.microsoft.com/office/word/2018/wordml/cex" xmlns:w16cid="http://schemas.microsoft.com/office/word/2016/wordml/cid" xmlns:w16="http://schemas.microsoft.com/office/word/2018/wordml" xmlns:w16du="http://schemas.microsoft.com/office/word/2023/wordml/word16du" xmlns:w16sdtdh="http://schemas.microsoft.com/office/word/2020/wordml/sdtdatahash" xmlns:w16sdtfl="http://schemas.microsoft.com/office/word/2024/wordml/sdtformatlock" xmlns:w16se="http://schemas.microsoft.com/office/word/2015/wordml/symex" xmlns:wpg="http://schemas.microsoft.com/office/word/2010/wordprocessingGroup" xmlns:wpi="http://schemas.microsoft.com/office/word/2010/wordprocessingInk" xmlns:wne="http://schemas.microsoft.com/office/word/2006/wordml" xmlns:wps="http://schemas.microsoft.com/office/word/2010/wordprocessingShape" mc:Ignorable="w14 w15 w16se w16cid w16 w16cex w16sdtdh w16sdtfl w16du wp14">
   <w:abstractNum w:abstractNumId="0" w15:restartNumberingAfterBreak="0">
-    <w:nsid w:val="15227AAA"/>
+    <w:nsid w:val="374767D9"/>
     <w:multiLevelType w:val="hybridMultilevel"/>
-    <w:tmpl w:val="38D47F60"/>
-    <w:lvl w:ilvl="0" w:tplc="01B83B76">
-      <w:start w:val="1"/>
-      <w:numFmt w:val="decimal"/>
-      <w:lvlText w:val="%1."/>
-      <w:lvlJc w:val="left"/>
-      <w:pPr>
-        <w:ind w:left="360" w:hanging="300"/>
-      </w:pPr>
-    </w:lvl>
-    <w:lvl w:ilvl="1" w:tplc="90DA5F7C" w:tentative="1">
-      <w:start w:val="1"/>
-      <w:numFmt w:val="decimal"/>
-      <w:lvlText w:val="%2."/>
-      <w:lvlJc w:val="left"/>
-      <w:pPr>
-        <w:ind w:left="720" w:hanging="300"/>
-      </w:pPr>
-    </w:lvl>
-    <w:lvl w:ilvl="2" w:tplc="B2D05E42" w:tentative="1">
-      <w:start w:val="1"/>
-      <w:numFmt w:val="decimal"/>
-      <w:lvlText w:val="%3."/>
-      <w:lvlJc w:val="left"/>
-      <w:pPr>
-        <w:ind w:left="1080" w:hanging="300"/>
-      </w:pPr>
-    </w:lvl>
-    <w:lvl w:ilvl="3" w:tplc="877032D6">
-      <w:numFmt w:val="decimal"/>
-      <w:lvlText w:val=""/>
-      <w:lvlJc w:val="left"/>
-    </w:lvl>
-    <w:lvl w:ilvl="4" w:tplc="B0FE9B16">
-      <w:numFmt w:val="decimal"/>
-      <w:lvlText w:val=""/>
-      <w:lvlJc w:val="left"/>
-    </w:lvl>
-    <w:lvl w:ilvl="5" w:tplc="3126F9AA">
-      <w:numFmt w:val="decimal"/>
-      <w:lvlText w:val=""/>
-      <w:lvlJc w:val="left"/>
-    </w:lvl>
-    <w:lvl w:ilvl="6" w:tplc="B12432C6">
-      <w:numFmt w:val="decimal"/>
-      <w:lvlText w:val=""/>
-      <w:lvlJc w:val="left"/>
-    </w:lvl>
-    <w:lvl w:ilvl="7" w:tplc="392EE65A">
-      <w:numFmt w:val="decimal"/>
-      <w:lvlText w:val=""/>
-      <w:lvlJc w:val="left"/>
-    </w:lvl>
-    <w:lvl w:ilvl="8" w:tplc="C380A900">
-      <w:numFmt w:val="decimal"/>
-      <w:lvlText w:val=""/>
-      <w:lvlJc w:val="left"/>
-    </w:lvl>
-  </w:abstractNum>
-  <w:abstractNum w:abstractNumId="1" w15:restartNumberingAfterBreak="0">
-    <w:nsid w:val="253357A6"/>
-    <w:multiLevelType w:val="hybridMultilevel"/>
-    <w:tmpl w:val="9C90B50C"/>
-    <w:lvl w:ilvl="0" w:tplc="2D3E174A">
-      <w:start w:val="1"/>
-      <w:numFmt w:val="bullet"/>
-      <w:lvlText w:val="•"/>
-      <w:lvlJc w:val="left"/>
-      <w:pPr>
-        <w:ind w:left="360" w:hanging="260"/>
-      </w:pPr>
-    </w:lvl>
-    <w:lvl w:ilvl="1" w:tplc="BB16E63C" w:tentative="1">
-      <w:start w:val="1"/>
-      <w:numFmt w:val="bullet"/>
-      <w:lvlText w:val="◦"/>
-      <w:lvlJc w:val="left"/>
-      <w:pPr>
-        <w:ind w:left="720" w:hanging="260"/>
-      </w:pPr>
-    </w:lvl>
-    <w:lvl w:ilvl="2" w:tplc="41F23FF2" w:tentative="1">
-      <w:start w:val="1"/>
-      <w:numFmt w:val="bullet"/>
-      <w:lvlText w:val="▪"/>
-      <w:lvlJc w:val="left"/>
-      <w:pPr>
-        <w:ind w:left="1080" w:hanging="260"/>
-      </w:pPr>
-    </w:lvl>
-    <w:lvl w:ilvl="3" w:tplc="B3A2DE14">
-      <w:numFmt w:val="decimal"/>
-      <w:lvlText w:val=""/>
-      <w:lvlJc w:val="left"/>
-    </w:lvl>
-    <w:lvl w:ilvl="4" w:tplc="2FC85F0E">
-      <w:numFmt w:val="decimal"/>
-      <w:lvlText w:val=""/>
-      <w:lvlJc w:val="left"/>
-    </w:lvl>
-    <w:lvl w:ilvl="5" w:tplc="1B04EAA8">
-      <w:numFmt w:val="decimal"/>
-      <w:lvlText w:val=""/>
-      <w:lvlJc w:val="left"/>
-    </w:lvl>
-    <w:lvl w:ilvl="6" w:tplc="C8AADA88">
-      <w:numFmt w:val="decimal"/>
-      <w:lvlText w:val=""/>
-      <w:lvlJc w:val="left"/>
-    </w:lvl>
-    <w:lvl w:ilvl="7" w:tplc="3274D5C0">
-      <w:numFmt w:val="decimal"/>
-      <w:lvlText w:val=""/>
-      <w:lvlJc w:val="left"/>
-    </w:lvl>
-    <w:lvl w:ilvl="8" w:tplc="D0422CFC">
-      <w:numFmt w:val="decimal"/>
-      <w:lvlText w:val=""/>
-      <w:lvlJc w:val="left"/>
-    </w:lvl>
-  </w:abstractNum>
-  <w:abstractNum w:abstractNumId="2" w15:restartNumberingAfterBreak="0">
-    <w:nsid w:val="2DDD3903"/>
-    <w:multiLevelType w:val="hybridMultilevel"/>
-    <w:tmpl w:val="82BCE42C"/>
-    <w:lvl w:ilvl="0" w:tplc="0C7E7D7A" w:tentative="1">
+    <w:tmpl w:val="0D003818"/>
+    <w:lvl w:ilvl="0" w:tplc="74E88866" w:tentative="1">
       <w:start w:val="1"/>
       <w:numFmt w:val="bullet"/>
       <w:lvlText w:val="●"/>
@@ -29951,7 +29835,7 @@
         <w:ind w:left="720" w:hanging="360"/>
       </w:pPr>
     </w:lvl>
-    <w:lvl w:ilvl="1" w:tplc="3B1C0F6E" w:tentative="1">
+    <w:lvl w:ilvl="1" w:tplc="3628EBE2" w:tentative="1">
       <w:start w:val="1"/>
       <w:numFmt w:val="bullet"/>
       <w:lvlText w:val="○"/>
@@ -29960,7 +29844,7 @@
         <w:ind w:left="1440" w:hanging="360"/>
       </w:pPr>
     </w:lvl>
-    <w:lvl w:ilvl="2" w:tplc="40E4C9C6" w:tentative="1">
+    <w:lvl w:ilvl="2" w:tplc="F22C1EDC" w:tentative="1">
       <w:start w:val="1"/>
       <w:numFmt w:val="bullet"/>
       <w:lvlText w:val="■"/>
@@ -29969,7 +29853,7 @@
         <w:ind w:left="2160" w:hanging="360"/>
       </w:pPr>
     </w:lvl>
-    <w:lvl w:ilvl="3" w:tplc="4C942BFA" w:tentative="1">
+    <w:lvl w:ilvl="3" w:tplc="649E774E" w:tentative="1">
       <w:start w:val="1"/>
       <w:numFmt w:val="bullet"/>
       <w:lvlText w:val="●"/>
@@ -29978,7 +29862,7 @@
         <w:ind w:left="2880" w:hanging="360"/>
       </w:pPr>
     </w:lvl>
-    <w:lvl w:ilvl="4" w:tplc="72EC5EF4" w:tentative="1">
+    <w:lvl w:ilvl="4" w:tplc="5F907E3E" w:tentative="1">
       <w:start w:val="1"/>
       <w:numFmt w:val="bullet"/>
       <w:lvlText w:val="○"/>
@@ -29987,7 +29871,7 @@
         <w:ind w:left="3600" w:hanging="360"/>
       </w:pPr>
     </w:lvl>
-    <w:lvl w:ilvl="5" w:tplc="0A3E3D96" w:tentative="1">
+    <w:lvl w:ilvl="5" w:tplc="9ED03D4A" w:tentative="1">
       <w:start w:val="1"/>
       <w:numFmt w:val="bullet"/>
       <w:lvlText w:val="■"/>
@@ -29996,7 +29880,7 @@
         <w:ind w:left="4320" w:hanging="360"/>
       </w:pPr>
     </w:lvl>
-    <w:lvl w:ilvl="6" w:tplc="01B83CFC" w:tentative="1">
+    <w:lvl w:ilvl="6" w:tplc="971815CC" w:tentative="1">
       <w:start w:val="1"/>
       <w:numFmt w:val="bullet"/>
       <w:lvlText w:val="●"/>
@@ -30005,7 +29889,7 @@
         <w:ind w:left="5040" w:hanging="360"/>
       </w:pPr>
     </w:lvl>
-    <w:lvl w:ilvl="7" w:tplc="12F236F0" w:tentative="1">
+    <w:lvl w:ilvl="7" w:tplc="9C46C7B2" w:tentative="1">
       <w:start w:val="1"/>
       <w:numFmt w:val="bullet"/>
       <w:lvlText w:val="●"/>
@@ -30014,7 +29898,7 @@
         <w:ind w:left="5760" w:hanging="360"/>
       </w:pPr>
     </w:lvl>
-    <w:lvl w:ilvl="8" w:tplc="0F884BEC" w:tentative="1">
+    <w:lvl w:ilvl="8" w:tplc="87146944" w:tentative="1">
       <w:start w:val="1"/>
       <w:numFmt w:val="bullet"/>
       <w:lvlText w:val="●"/>
@@ -30024,14 +29908,138 @@
       </w:pPr>
     </w:lvl>
   </w:abstractNum>
-  <w:num w:numId="1" w16cid:durableId="353968331">
-    <w:abstractNumId w:val="2"/>
+  <w:abstractNum w:abstractNumId="1" w15:restartNumberingAfterBreak="0">
+    <w:nsid w:val="5E0A62B5"/>
+    <w:multiLevelType w:val="hybridMultilevel"/>
+    <w:tmpl w:val="0BA037F4"/>
+    <w:lvl w:ilvl="0" w:tplc="DB001080">
+      <w:start w:val="1"/>
+      <w:numFmt w:val="decimal"/>
+      <w:lvlText w:val="%1."/>
+      <w:lvlJc w:val="left"/>
+      <w:pPr>
+        <w:ind w:left="360" w:hanging="300"/>
+      </w:pPr>
+    </w:lvl>
+    <w:lvl w:ilvl="1" w:tplc="6FF6CBE6" w:tentative="1">
+      <w:start w:val="1"/>
+      <w:numFmt w:val="decimal"/>
+      <w:lvlText w:val="%2."/>
+      <w:lvlJc w:val="left"/>
+      <w:pPr>
+        <w:ind w:left="720" w:hanging="300"/>
+      </w:pPr>
+    </w:lvl>
+    <w:lvl w:ilvl="2" w:tplc="F080EEB8" w:tentative="1">
+      <w:start w:val="1"/>
+      <w:numFmt w:val="decimal"/>
+      <w:lvlText w:val="%3."/>
+      <w:lvlJc w:val="left"/>
+      <w:pPr>
+        <w:ind w:left="1080" w:hanging="300"/>
+      </w:pPr>
+    </w:lvl>
+    <w:lvl w:ilvl="3" w:tplc="86F29C04">
+      <w:numFmt w:val="decimal"/>
+      <w:lvlText w:val=""/>
+      <w:lvlJc w:val="left"/>
+    </w:lvl>
+    <w:lvl w:ilvl="4" w:tplc="D9F8A166">
+      <w:numFmt w:val="decimal"/>
+      <w:lvlText w:val=""/>
+      <w:lvlJc w:val="left"/>
+    </w:lvl>
+    <w:lvl w:ilvl="5" w:tplc="2E0CEE98">
+      <w:numFmt w:val="decimal"/>
+      <w:lvlText w:val=""/>
+      <w:lvlJc w:val="left"/>
+    </w:lvl>
+    <w:lvl w:ilvl="6" w:tplc="BB5AEA5A">
+      <w:numFmt w:val="decimal"/>
+      <w:lvlText w:val=""/>
+      <w:lvlJc w:val="left"/>
+    </w:lvl>
+    <w:lvl w:ilvl="7" w:tplc="3F32F1DC">
+      <w:numFmt w:val="decimal"/>
+      <w:lvlText w:val=""/>
+      <w:lvlJc w:val="left"/>
+    </w:lvl>
+    <w:lvl w:ilvl="8" w:tplc="16948170">
+      <w:numFmt w:val="decimal"/>
+      <w:lvlText w:val=""/>
+      <w:lvlJc w:val="left"/>
+    </w:lvl>
+  </w:abstractNum>
+  <w:abstractNum w:abstractNumId="2" w15:restartNumberingAfterBreak="0">
+    <w:nsid w:val="6EAB6701"/>
+    <w:multiLevelType w:val="hybridMultilevel"/>
+    <w:tmpl w:val="D250084A"/>
+    <w:lvl w:ilvl="0" w:tplc="489E6D0C">
+      <w:start w:val="1"/>
+      <w:numFmt w:val="bullet"/>
+      <w:lvlText w:val="•"/>
+      <w:lvlJc w:val="left"/>
+      <w:pPr>
+        <w:ind w:left="360" w:hanging="260"/>
+      </w:pPr>
+    </w:lvl>
+    <w:lvl w:ilvl="1" w:tplc="D466CA74" w:tentative="1">
+      <w:start w:val="1"/>
+      <w:numFmt w:val="bullet"/>
+      <w:lvlText w:val="◦"/>
+      <w:lvlJc w:val="left"/>
+      <w:pPr>
+        <w:ind w:left="720" w:hanging="260"/>
+      </w:pPr>
+    </w:lvl>
+    <w:lvl w:ilvl="2" w:tplc="69DEDC9E" w:tentative="1">
+      <w:start w:val="1"/>
+      <w:numFmt w:val="bullet"/>
+      <w:lvlText w:val="▪"/>
+      <w:lvlJc w:val="left"/>
+      <w:pPr>
+        <w:ind w:left="1080" w:hanging="260"/>
+      </w:pPr>
+    </w:lvl>
+    <w:lvl w:ilvl="3" w:tplc="40765BFC">
+      <w:numFmt w:val="decimal"/>
+      <w:lvlText w:val=""/>
+      <w:lvlJc w:val="left"/>
+    </w:lvl>
+    <w:lvl w:ilvl="4" w:tplc="656AF51A">
+      <w:numFmt w:val="decimal"/>
+      <w:lvlText w:val=""/>
+      <w:lvlJc w:val="left"/>
+    </w:lvl>
+    <w:lvl w:ilvl="5" w:tplc="7F9621C4">
+      <w:numFmt w:val="decimal"/>
+      <w:lvlText w:val=""/>
+      <w:lvlJc w:val="left"/>
+    </w:lvl>
+    <w:lvl w:ilvl="6" w:tplc="A84CDFC4">
+      <w:numFmt w:val="decimal"/>
+      <w:lvlText w:val=""/>
+      <w:lvlJc w:val="left"/>
+    </w:lvl>
+    <w:lvl w:ilvl="7" w:tplc="F1AC1180">
+      <w:numFmt w:val="decimal"/>
+      <w:lvlText w:val=""/>
+      <w:lvlJc w:val="left"/>
+    </w:lvl>
+    <w:lvl w:ilvl="8" w:tplc="A64EA808">
+      <w:numFmt w:val="decimal"/>
+      <w:lvlText w:val=""/>
+      <w:lvlJc w:val="left"/>
+    </w:lvl>
+  </w:abstractNum>
+  <w:num w:numId="1" w16cid:durableId="702440467">
+    <w:abstractNumId w:val="0"/>
     <w:lvlOverride w:ilvl="0">
       <w:startOverride w:val="1"/>
     </w:lvlOverride>
   </w:num>
-  <w:num w:numId="2" w16cid:durableId="2092005329">
-    <w:abstractNumId w:val="0"/>
+  <w:num w:numId="2" w16cid:durableId="1401947091">
+    <w:abstractNumId w:val="1"/>
     <w:lvlOverride w:ilvl="0">
       <w:startOverride w:val="1"/>
     </w:lvlOverride>
@@ -30042,8 +30050,8 @@
       <w:startOverride w:val="1"/>
     </w:lvlOverride>
   </w:num>
-  <w:num w:numId="3" w16cid:durableId="524444970">
-    <w:abstractNumId w:val="0"/>
+  <w:num w:numId="3" w16cid:durableId="706101285">
+    <w:abstractNumId w:val="1"/>
     <w:lvlOverride w:ilvl="0">
       <w:startOverride w:val="1"/>
     </w:lvlOverride>
@@ -30054,8 +30062,8 @@
       <w:startOverride w:val="1"/>
     </w:lvlOverride>
   </w:num>
-  <w:num w:numId="4" w16cid:durableId="607083782">
-    <w:abstractNumId w:val="1"/>
+  <w:num w:numId="4" w16cid:durableId="746994175">
+    <w:abstractNumId w:val="2"/>
     <w:lvlOverride w:ilvl="0">
       <w:startOverride w:val="1"/>
     </w:lvlOverride>

</xml_diff>